<commit_message>
feat(contracts): merge scenarios, add VAT selector, 6m expiry alert, and smart coordinate parser
</commit_message>
<xml_diff>
--- a/tvt3_v2/public/templates/HOP_DONG_MOI_CSHT.docx
+++ b/tvt3_v2/public/templates/HOP_DONG_MOI_CSHT.docx
@@ -1,6 +1,6 @@
 
 <file path=word/document.xml><?xml version="1.0" encoding="utf-8"?>
-<w:document xmlns:wpc="http://schemas.microsoft.com/office/word/2010/wordprocessingCanvas" xmlns:cx="http://schemas.microsoft.com/office/drawing/2014/chartex" xmlns:cx1="http://schemas.microsoft.com/office/drawing/2015/9/8/chartex" xmlns:cx2="http://schemas.microsoft.com/office/drawing/2015/10/21/chartex" xmlns:cx3="http://schemas.microsoft.com/office/drawing/2016/5/9/chartex" xmlns:cx4="http://schemas.microsoft.com/office/drawing/2016/5/10/chartex" xmlns:cx5="http://schemas.microsoft.com/office/drawing/2016/5/11/chartex" xmlns:cx6="http://schemas.microsoft.com/office/drawing/2016/5/12/chartex" xmlns:cx7="http://schemas.microsoft.com/office/drawing/2016/5/13/chartex" xmlns:cx8="http://schemas.microsoft.com/office/drawing/2016/5/14/chartex" xmlns:mc="http://schemas.openxmlformats.org/markup-compatibility/2006" xmlns:aink="http://schemas.microsoft.com/office/drawing/2016/ink" xmlns:am3d="http://schemas.microsoft.com/office/drawing/2017/model3d" xmlns:o="urn:schemas-microsoft-com:office:office" xmlns:oel="http://schemas.microsoft.com/office/2019/extlst" xmlns:r="http://schemas.openxmlformats.org/officeDocument/2006/relationships" xmlns:m="http://schemas.openxmlformats.org/officeDocument/2006/math" xmlns:v="urn:schemas-microsoft-com:vml" xmlns:wp14="http://schemas.microsoft.com/office/word/2010/wordprocessingDrawing" xmlns:wp="http://schemas.openxmlformats.org/drawingml/2006/wordprocessingDrawing" xmlns:w10="urn:schemas-microsoft-com:office:word" xmlns:w="http://schemas.openxmlformats.org/wordprocessingml/2006/main" xmlns:w14="http://schemas.microsoft.com/office/word/2010/wordml" xmlns:w15="http://schemas.microsoft.com/office/word/2012/wordml" xmlns:w16cex="http://schemas.microsoft.com/office/word/2018/wordml/cex" xmlns:w16cid="http://schemas.microsoft.com/office/word/2016/wordml/cid" xmlns:w16="http://schemas.microsoft.com/office/word/2018/wordml" xmlns:w16du="http://schemas.microsoft.com/office/word/2023/wordml/word16du" xmlns:w16sdtdh="http://schemas.microsoft.com/office/word/2020/wordml/sdtdatahash" xmlns:w16sdtfl="http://schemas.microsoft.com/office/word/2024/wordml/sdtformatlock" xmlns:w16se="http://schemas.microsoft.com/office/word/2015/wordml/symex" xmlns:wpg="http://schemas.microsoft.com/office/word/2010/wordprocessingGroup" xmlns:wpi="http://schemas.microsoft.com/office/word/2010/wordprocessingInk" xmlns:wne="http://schemas.microsoft.com/office/word/2006/wordml" xmlns:wps="http://schemas.microsoft.com/office/word/2010/wordprocessingShape" mc:Ignorable="w14 w15 w16se w16cid w16 w16cex w16sdtdh w16sdtfl w16du wp14">
+<w:document xmlns:a="http://schemas.openxmlformats.org/drawingml/2006/main" xmlns:a14="http://schemas.microsoft.com/office/drawing/2010/main" xmlns:wpc="http://schemas.microsoft.com/office/word/2010/wordprocessingCanvas" xmlns:cx="http://schemas.microsoft.com/office/drawing/2014/chartex" xmlns:cx1="http://schemas.microsoft.com/office/drawing/2015/9/8/chartex" xmlns:cx2="http://schemas.microsoft.com/office/drawing/2015/10/21/chartex" xmlns:cx3="http://schemas.microsoft.com/office/drawing/2016/5/9/chartex" xmlns:cx4="http://schemas.microsoft.com/office/drawing/2016/5/10/chartex" xmlns:cx5="http://schemas.microsoft.com/office/drawing/2016/5/11/chartex" xmlns:cx6="http://schemas.microsoft.com/office/drawing/2016/5/12/chartex" xmlns:cx7="http://schemas.microsoft.com/office/drawing/2016/5/13/chartex" xmlns:cx8="http://schemas.microsoft.com/office/drawing/2016/5/14/chartex" xmlns:mc="http://schemas.openxmlformats.org/markup-compatibility/2006" xmlns:aink="http://schemas.microsoft.com/office/drawing/2016/ink" xmlns:am3d="http://schemas.microsoft.com/office/drawing/2017/model3d" xmlns:o="urn:schemas-microsoft-com:office:office" xmlns:oel="http://schemas.microsoft.com/office/2019/extlst" xmlns:r="http://schemas.openxmlformats.org/officeDocument/2006/relationships" xmlns:m="http://schemas.openxmlformats.org/officeDocument/2006/math" xmlns:v="urn:schemas-microsoft-com:vml" xmlns:wp14="http://schemas.microsoft.com/office/word/2010/wordprocessingDrawing" xmlns:wp="http://schemas.openxmlformats.org/drawingml/2006/wordprocessingDrawing" xmlns:w10="urn:schemas-microsoft-com:office:word" xmlns:w="http://schemas.openxmlformats.org/wordprocessingml/2006/main" xmlns:w14="http://schemas.microsoft.com/office/word/2010/wordml" xmlns:w15="http://schemas.microsoft.com/office/word/2012/wordml" xmlns:w16cex="http://schemas.microsoft.com/office/word/2018/wordml/cex" xmlns:w16cid="http://schemas.microsoft.com/office/word/2016/wordml/cid" xmlns:w16="http://schemas.microsoft.com/office/word/2018/wordml" xmlns:w16du="http://schemas.microsoft.com/office/word/2023/wordml/word16du" xmlns:w16sdtdh="http://schemas.microsoft.com/office/word/2020/wordml/sdtdatahash" xmlns:w16sdtfl="http://schemas.microsoft.com/office/word/2024/wordml/sdtformatlock" xmlns:w16se="http://schemas.microsoft.com/office/word/2015/wordml/symex" xmlns:wpg="http://schemas.microsoft.com/office/word/2010/wordprocessingGroup" xmlns:wpi="http://schemas.microsoft.com/office/word/2010/wordprocessingInk" xmlns:wne="http://schemas.microsoft.com/office/word/2006/wordml" xmlns:wps="http://schemas.microsoft.com/office/word/2010/wordprocessingShape" mc:Ignorable="w14 w15 w16se w16cid w16 w16cex w16sdtdh w16sdtfl w16du wp14">
   <w:body>
     <w:tbl>
       <w:tblPr>
@@ -127,7 +127,7 @@
               <mc:AlternateContent>
                 <mc:Choice Requires="wps">
                   <w:drawing>
-                    <wp:anchor distT="0" distB="0" distL="114300" distR="114300" simplePos="0" relativeHeight="251661312" behindDoc="0" locked="0" layoutInCell="1" allowOverlap="1" wp14:anchorId="61315F5F" wp14:editId="3E24A989">
+                    <wp:anchor distT="0" distB="0" distL="114300" distR="114300" simplePos="0" relativeHeight="251661312" behindDoc="0" locked="0" layoutInCell="1" allowOverlap="1" wp14:editId="3E24A989" wp14:anchorId="61315F5F">
                       <wp:simplePos x="0" y="0"/>
                       <wp:positionH relativeFrom="column">
                         <wp:posOffset>652780</wp:posOffset>
@@ -181,7 +181,7 @@
                 </mc:Choice>
                 <mc:Fallback>
                   <w:pict>
-                    <v:line w14:anchorId="3A8FE28D" id="Straight Connector 2000649774" o:spid="_x0000_s1026" style="position:absolute;flip:x;z-index:251661312;visibility:visible;mso-wrap-style:square;mso-wrap-distance-left:9pt;mso-wrap-distance-top:0;mso-wrap-distance-right:9pt;mso-wrap-distance-bottom:0;mso-position-horizontal:absolute;mso-position-horizontal-relative:text;mso-position-vertical:absolute;mso-position-vertical-relative:text" from="51.4pt,3.8pt" to="174.3pt,3.8pt" o:gfxdata="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" strokecolor="black [3213]" strokeweight=".5pt">
+                    <v:line id="Straight Connector 2000649774" style="position:absolute;flip:x;z-index:251661312;visibility:visible;mso-wrap-style:square;mso-wrap-distance-left:9pt;mso-wrap-distance-top:0;mso-wrap-distance-right:9pt;mso-wrap-distance-bottom:0;mso-position-horizontal:absolute;mso-position-horizontal-relative:text;mso-position-vertical:absolute;mso-position-vertical-relative:text" o:spid="_x0000_s1026" strokecolor="black [3213]" strokeweight=".5pt" o:gfxdata="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" from="51.4pt,3.8pt" to="174.3pt,3.8pt" w14:anchorId="3A8FE28D">
                       <v:stroke joinstyle="miter"/>
                     </v:line>
                   </w:pict>
@@ -213,7 +213,7 @@
               <mc:AlternateContent>
                 <mc:Choice Requires="wps">
                   <w:drawing>
-                    <wp:anchor distT="0" distB="0" distL="114300" distR="114300" simplePos="0" relativeHeight="251660288" behindDoc="0" locked="0" layoutInCell="1" allowOverlap="1" wp14:anchorId="1F88C76F" wp14:editId="5D57BEEB">
+                    <wp:anchor distT="0" distB="0" distL="114300" distR="114300" simplePos="0" relativeHeight="251660288" behindDoc="0" locked="0" layoutInCell="1" allowOverlap="1" wp14:editId="5D57BEEB" wp14:anchorId="1F88C76F">
                       <wp:simplePos x="0" y="0"/>
                       <wp:positionH relativeFrom="column">
                         <wp:posOffset>848360</wp:posOffset>
@@ -273,7 +273,7 @@
                 </mc:Choice>
                 <mc:Fallback>
                   <w:pict>
-                    <v:line w14:anchorId="7B0B0E0A" id="Straight Connector 1463436238" o:spid="_x0000_s1026" style="position:absolute;flip:y;z-index:251660288;visibility:visible;mso-wrap-style:square;mso-width-percent:0;mso-height-percent:0;mso-wrap-distance-left:9pt;mso-wrap-distance-top:0;mso-wrap-distance-right:9pt;mso-wrap-distance-bottom:0;mso-position-horizontal:absolute;mso-position-horizontal-relative:text;mso-position-vertical:absolute;mso-position-vertical-relative:text;mso-width-percent:0;mso-height-percent:0;mso-width-relative:margin;mso-height-relative:margin" from="66.8pt,5.25pt" to="223.7pt,5.25pt" o:gfxdata="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" strokecolor="black [3213]" strokeweight=".5pt">
+                    <v:line id="Straight Connector 1463436238" style="position:absolute;flip:y;z-index:251660288;visibility:visible;mso-wrap-style:square;mso-width-percent:0;mso-height-percent:0;mso-wrap-distance-left:9pt;mso-wrap-distance-top:0;mso-wrap-distance-right:9pt;mso-wrap-distance-bottom:0;mso-position-horizontal:absolute;mso-position-horizontal-relative:text;mso-position-vertical:absolute;mso-position-vertical-relative:text;mso-width-percent:0;mso-height-percent:0;mso-width-relative:margin;mso-height-relative:margin" o:spid="_x0000_s1026" strokecolor="black [3213]" strokeweight=".5pt" o:gfxdata="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" from="66.8pt,5.25pt" to="223.7pt,5.25pt" w14:anchorId="7B0B0E0A">
                       <v:stroke joinstyle="miter"/>
                     </v:line>
                   </w:pict>
@@ -329,7 +329,7 @@
                 <w:i/>
                 <w:szCs w:val="28"/>
               </w:rPr>
-              <w:t xml:space="preserve">Đồng Nai, ngày  </w:t>
+              <w:t xml:space="preserve">Đồng Nai, ngày </w:t>
             </w:r>
             <w:r>
               <w:rPr>
@@ -346,7 +346,7 @@
                 <w:i/>
                 <w:szCs w:val="28"/>
               </w:rPr>
-              <w:t xml:space="preserve">  tháng</w:t>
+              <w:t xml:space="preserve"> tháng</w:t>
             </w:r>
             <w:r>
               <w:rPr>
@@ -363,7 +363,7 @@
                 <w:i/>
                 <w:szCs w:val="28"/>
               </w:rPr>
-              <w:t xml:space="preserve">    năm 2026</w:t>
+              <w:t xml:space="preserve">  năm 2026</w:t>
             </w:r>
           </w:p>
         </w:tc>
@@ -473,88 +473,6 @@
       </w:pPr>
       <w:r>
         <w:rPr>
-          <w:rFonts w:ascii="Times New Roman" w:hAnsi="Times New Roman"/>
-          <w:b/>
-          <w:bCs/>
-          <w:noProof/>
-          <w:szCs w:val="25"/>
-        </w:rPr>
-        <w:drawing>
-          <wp:anchor distT="0" distB="0" distL="114300" distR="114300" simplePos="0" relativeHeight="251659264" behindDoc="1" locked="0" layoutInCell="1" allowOverlap="1" wp14:anchorId="0A443629" wp14:editId="75DE6EE0">
-            <wp:simplePos x="0" y="0"/>
-            <wp:positionH relativeFrom="margin">
-              <wp:align>center</wp:align>
-            </wp:positionH>
-            <wp:positionV relativeFrom="paragraph">
-              <wp:posOffset>97790</wp:posOffset>
-            </wp:positionV>
-            <wp:extent cx="2108200" cy="19050"/>
-            <wp:effectExtent l="0" t="0" r="6350" b="0"/>
-            <wp:wrapTight wrapText="bothSides">
-              <wp:wrapPolygon edited="0">
-                <wp:start x="0" y="0"/>
-                <wp:lineTo x="0" y="0"/>
-                <wp:lineTo x="21470" y="0"/>
-                <wp:lineTo x="21470" y="0"/>
-                <wp:lineTo x="0" y="0"/>
-              </wp:wrapPolygon>
-            </wp:wrapTight>
-            <wp:docPr id="384057371" name="Picture 1"/>
-            <wp:cNvGraphicFramePr>
-              <a:graphicFrameLocks xmlns:a="http://schemas.openxmlformats.org/drawingml/2006/main" noChangeAspect="1"/>
-            </wp:cNvGraphicFramePr>
-            <a:graphic xmlns:a="http://schemas.openxmlformats.org/drawingml/2006/main">
-              <a:graphicData uri="http://schemas.openxmlformats.org/drawingml/2006/picture">
-                <pic:pic xmlns:pic="http://schemas.openxmlformats.org/drawingml/2006/picture">
-                  <pic:nvPicPr>
-                    <pic:cNvPr id="0" name="Picture 2"/>
-                    <pic:cNvPicPr>
-                      <a:picLocks noChangeAspect="1" noChangeArrowheads="1"/>
-                    </pic:cNvPicPr>
-                  </pic:nvPicPr>
-                  <pic:blipFill>
-                    <a:blip r:embed="rId5">
-                      <a:extLst>
-                        <a:ext uri="{28A0092B-C50C-407E-A947-70E740481C1C}">
-                          <a14:useLocalDpi xmlns:a14="http://schemas.microsoft.com/office/drawing/2010/main" val="0"/>
-                        </a:ext>
-                      </a:extLst>
-                    </a:blip>
-                    <a:srcRect/>
-                    <a:stretch>
-                      <a:fillRect/>
-                    </a:stretch>
-                  </pic:blipFill>
-                  <pic:spPr bwMode="auto">
-                    <a:xfrm>
-                      <a:off x="0" y="0"/>
-                      <a:ext cx="2108200" cy="19050"/>
-                    </a:xfrm>
-                    <a:prstGeom prst="rect">
-                      <a:avLst/>
-                    </a:prstGeom>
-                    <a:noFill/>
-                    <a:ln>
-                      <a:noFill/>
-                    </a:ln>
-                  </pic:spPr>
-                </pic:pic>
-              </a:graphicData>
-            </a:graphic>
-          </wp:anchor>
-        </w:drawing>
-      </w:r>
-    </w:p>
-    <w:p>
-      <w:pPr>
-        <w:spacing w:before="120" w:line="360" w:lineRule="exact"/>
-        <w:jc w:val="center"/>
-        <w:rPr>
-          <w:rFonts w:ascii="Times New Roman" w:hAnsi="Times New Roman"/>
-        </w:rPr>
-      </w:pPr>
-      <w:r>
-        <w:rPr>
           <w:rStyle w:val="Emphasis"/>
           <w:rFonts w:ascii="Times New Roman" w:hAnsi="Times New Roman"/>
           <w:i w:val="0"/>
@@ -584,10 +502,10 @@
     <w:p>
       <w:pPr>
         <w:pBdr>
-          <w:top w:val="single" w:sz="4" w:space="1" w:color="auto"/>
-          <w:left w:val="single" w:sz="4" w:space="4" w:color="auto"/>
-          <w:bottom w:val="single" w:sz="4" w:space="0" w:color="auto"/>
-          <w:right w:val="single" w:sz="4" w:space="0" w:color="auto"/>
+          <w:top w:val="single" w:color="auto" w:sz="4" w:space="1"/>
+          <w:left w:val="single" w:color="auto" w:sz="4" w:space="4"/>
+          <w:bottom w:val="single" w:color="auto" w:sz="4" w:space="0"/>
+          <w:right w:val="single" w:color="auto" w:sz="4" w:space="0"/>
         </w:pBdr>
         <w:spacing w:before="120" w:line="360" w:lineRule="exact"/>
         <w:jc w:val="center"/>
@@ -602,101 +520,6 @@
           <w:szCs w:val="26"/>
         </w:rPr>
         <w:t>Ý kiến chỉ đạo của Lãnh đạo MobiFone Đồng Nai</w:t>
-      </w:r>
-    </w:p>
-    <w:p>
-      <w:pPr>
-        <w:pBdr>
-          <w:top w:val="single" w:sz="4" w:space="1" w:color="auto"/>
-          <w:left w:val="single" w:sz="4" w:space="4" w:color="auto"/>
-          <w:bottom w:val="single" w:sz="4" w:space="0" w:color="auto"/>
-          <w:right w:val="single" w:sz="4" w:space="0" w:color="auto"/>
-        </w:pBdr>
-        <w:spacing w:before="120" w:line="360" w:lineRule="exact"/>
-        <w:jc w:val="center"/>
-        <w:rPr>
-          <w:rFonts w:ascii="Times New Roman" w:hAnsi="Times New Roman"/>
-        </w:rPr>
-      </w:pPr>
-      <w:r>
-        <w:rPr>
-          <w:rFonts w:ascii="Times New Roman" w:hAnsi="Times New Roman"/>
-        </w:rPr>
-        <w:t> </w:t>
-      </w:r>
-    </w:p>
-    <w:p>
-      <w:pPr>
-        <w:pBdr>
-          <w:top w:val="single" w:sz="4" w:space="1" w:color="auto"/>
-          <w:left w:val="single" w:sz="4" w:space="4" w:color="auto"/>
-          <w:bottom w:val="single" w:sz="4" w:space="0" w:color="auto"/>
-          <w:right w:val="single" w:sz="4" w:space="0" w:color="auto"/>
-        </w:pBdr>
-        <w:spacing w:before="120" w:line="360" w:lineRule="exact"/>
-        <w:jc w:val="center"/>
-        <w:rPr>
-          <w:rFonts w:ascii="Times New Roman" w:hAnsi="Times New Roman"/>
-        </w:rPr>
-      </w:pPr>
-      <w:r>
-        <w:rPr>
-          <w:rFonts w:ascii="Times New Roman" w:hAnsi="Times New Roman"/>
-          <w:szCs w:val="28"/>
-          <w:lang w:val="sv-SE"/>
-        </w:rPr>
-        <w:t> </w:t>
-      </w:r>
-    </w:p>
-    <w:p>
-      <w:pPr>
-        <w:pBdr>
-          <w:top w:val="single" w:sz="4" w:space="1" w:color="auto"/>
-          <w:left w:val="single" w:sz="4" w:space="4" w:color="auto"/>
-          <w:bottom w:val="single" w:sz="4" w:space="0" w:color="auto"/>
-          <w:right w:val="single" w:sz="4" w:space="0" w:color="auto"/>
-        </w:pBdr>
-        <w:spacing w:before="120" w:line="360" w:lineRule="exact"/>
-        <w:jc w:val="center"/>
-        <w:rPr>
-          <w:rFonts w:ascii="Times New Roman" w:hAnsi="Times New Roman"/>
-        </w:rPr>
-      </w:pPr>
-    </w:p>
-    <w:p>
-      <w:pPr>
-        <w:pBdr>
-          <w:top w:val="single" w:sz="4" w:space="1" w:color="auto"/>
-          <w:left w:val="single" w:sz="4" w:space="4" w:color="auto"/>
-          <w:bottom w:val="single" w:sz="4" w:space="0" w:color="auto"/>
-          <w:right w:val="single" w:sz="4" w:space="0" w:color="auto"/>
-        </w:pBdr>
-        <w:spacing w:before="120" w:line="360" w:lineRule="exact"/>
-        <w:jc w:val="center"/>
-        <w:rPr>
-          <w:rFonts w:ascii="Times New Roman" w:hAnsi="Times New Roman"/>
-        </w:rPr>
-      </w:pPr>
-    </w:p>
-    <w:p>
-      <w:pPr>
-        <w:pBdr>
-          <w:top w:val="single" w:sz="4" w:space="1" w:color="auto"/>
-          <w:left w:val="single" w:sz="4" w:space="4" w:color="auto"/>
-          <w:bottom w:val="single" w:sz="4" w:space="0" w:color="auto"/>
-          <w:right w:val="single" w:sz="4" w:space="0" w:color="auto"/>
-        </w:pBdr>
-        <w:spacing w:before="120" w:line="360" w:lineRule="exact"/>
-        <w:jc w:val="center"/>
-        <w:rPr>
-          <w:rFonts w:ascii="Times New Roman" w:hAnsi="Times New Roman"/>
-        </w:rPr>
-      </w:pPr>
-      <w:r>
-        <w:rPr>
-          <w:rFonts w:ascii="Times New Roman" w:hAnsi="Times New Roman"/>
-        </w:rPr>
-        <w:t> </w:t>
       </w:r>
     </w:p>
     <w:p>
@@ -974,7 +797,7 @@
           <w:szCs w:val="26"/>
           <w:lang w:val="vi-VN"/>
         </w:rPr>
-        <w:t xml:space="preserve">     </w:t>
+        <w:t xml:space="preserve"> </w:t>
       </w:r>
       <w:r>
         <w:rPr>
@@ -1041,14 +864,14 @@
           <w:szCs w:val="26"/>
           <w:lang w:val="vi-VN"/>
         </w:rPr>
-        <w:t xml:space="preserve"> {{NEW_PRICE}} đồng/tháng (bằng chữ: {{NEW_PRICE_TEXT}})</w:t>
-      </w:r>
-      <w:r>
-        <w:rPr>
-          <w:rFonts w:ascii="Times New Roman" w:hAnsi="Times New Roman"/>
-          <w:szCs w:val="26"/>
-        </w:rPr>
-        <w:t xml:space="preserve">với đơn giá chi tiết theo các hạng mục như sau:  </w:t>
+        <w:t xml:space="preserve"> {{NEW_PRICE}} đồng/tháng (bằng chữ: {{NEW_PRICE_TEXT}}) với</w:t>
+      </w:r>
+      <w:r>
+        <w:rPr>
+          <w:rFonts w:ascii="Times New Roman" w:hAnsi="Times New Roman"/>
+          <w:szCs w:val="26"/>
+        </w:rPr>
+        <w:t xml:space="preserve"> đơn giá chi tiết theo các hạng mục như sau: </w:t>
       </w:r>
     </w:p>
     <w:tbl>
@@ -1056,12 +879,12 @@
         <w:tblW w:w="11143" w:type="dxa"/>
         <w:tblInd w:w="-905" w:type="dxa"/>
         <w:tblBorders>
-          <w:top w:val="single" w:sz="4" w:space="0" w:color="auto"/>
-          <w:left w:val="single" w:sz="4" w:space="0" w:color="auto"/>
-          <w:bottom w:val="single" w:sz="4" w:space="0" w:color="auto"/>
-          <w:right w:val="single" w:sz="4" w:space="0" w:color="auto"/>
-          <w:insideH w:val="single" w:sz="4" w:space="0" w:color="auto"/>
-          <w:insideV w:val="single" w:sz="4" w:space="0" w:color="auto"/>
+          <w:top w:val="single" w:color="auto" w:sz="4" w:space="0"/>
+          <w:left w:val="single" w:color="auto" w:sz="4" w:space="0"/>
+          <w:bottom w:val="single" w:color="auto" w:sz="4" w:space="0"/>
+          <w:right w:val="single" w:color="auto" w:sz="4" w:space="0"/>
+          <w:insideH w:val="single" w:color="auto" w:sz="4" w:space="0"/>
+          <w:insideV w:val="single" w:color="auto" w:sz="4" w:space="0"/>
         </w:tblBorders>
         <w:tblLook w:val="04A0" w:firstRow="1" w:lastRow="0" w:firstColumn="1" w:lastColumn="0" w:noHBand="0" w:noVBand="1"/>
       </w:tblPr>
@@ -1180,7 +1003,7 @@
                 <w:bCs/>
                 <w:szCs w:val="26"/>
               </w:rPr>
-              <w:t>Giảm trừ  dùng chung</w:t>
+              <w:t>Giảm trừ dùng chung</w:t>
             </w:r>
           </w:p>
         </w:tc>
@@ -1928,29 +1751,6 @@
           <w:lang w:val="vi-VN"/>
         </w:rPr>
         <w:t>Viễn thông có cơ sở thực hiện./.</w:t>
-      </w:r>
-    </w:p>
-    <w:p>
-      <w:pPr>
-        <w:tabs>
-          <w:tab w:val="left" w:pos="426"/>
-          <w:tab w:val="left" w:pos="810"/>
-          <w:tab w:val="left" w:pos="3240"/>
-        </w:tabs>
-        <w:spacing w:before="120" w:line="360" w:lineRule="exact"/>
-        <w:ind w:left="540" w:firstLine="720"/>
-        <w:jc w:val="both"/>
-        <w:rPr>
-          <w:rFonts w:ascii="Times New Roman" w:hAnsi="Times New Roman"/>
-          <w:szCs w:val="26"/>
-        </w:rPr>
-      </w:pPr>
-      <w:r>
-        <w:rPr>
-          <w:rFonts w:ascii="Times New Roman" w:hAnsi="Times New Roman"/>
-          <w:szCs w:val="26"/>
-        </w:rPr>
-        <w:t> </w:t>
       </w:r>
     </w:p>
     <w:tbl>
@@ -2210,7 +2010,7 @@
                 <w:rFonts w:ascii="Times New Roman" w:hAnsi="Times New Roman"/>
                 <w:szCs w:val="26"/>
               </w:rPr>
-              <w:t xml:space="preserve">    </w:t>
+              <w:t xml:space="preserve"> </w:t>
             </w:r>
           </w:p>
         </w:tc>
@@ -2264,22 +2064,6 @@
         </w:tc>
       </w:tr>
     </w:tbl>
-    <w:p>
-      <w:pPr>
-        <w:tabs>
-          <w:tab w:val="left" w:pos="426"/>
-          <w:tab w:val="left" w:pos="810"/>
-          <w:tab w:val="left" w:pos="3240"/>
-        </w:tabs>
-        <w:spacing w:before="120" w:line="360" w:lineRule="exact"/>
-        <w:jc w:val="both"/>
-        <w:rPr>
-          <w:rFonts w:ascii="Times New Roman" w:hAnsi="Times New Roman"/>
-          <w:sz w:val="28"/>
-          <w:szCs w:val="28"/>
-        </w:rPr>
-      </w:pPr>
-    </w:p>
     <w:tbl>
       <w:tblPr>
         <w:tblpPr w:leftFromText="180" w:rightFromText="180" w:vertAnchor="text" w:horzAnchor="margin" w:tblpXSpec="center" w:tblpY="-832"/>
@@ -2393,7 +2177,7 @@
               <mc:AlternateContent>
                 <mc:Choice Requires="wps">
                   <w:drawing>
-                    <wp:anchor distT="4294967294" distB="4294967294" distL="114300" distR="114300" simplePos="0" relativeHeight="251667456" behindDoc="0" locked="0" layoutInCell="1" allowOverlap="1" wp14:anchorId="49CCB699" wp14:editId="4D85D922">
+                    <wp:anchor distT="4294967294" distB="4294967294" distL="114300" distR="114300" simplePos="0" relativeHeight="251667456" behindDoc="0" locked="0" layoutInCell="1" allowOverlap="1" wp14:editId="4D85D922" wp14:anchorId="49CCB699">
                       <wp:simplePos x="0" y="0"/>
                       <wp:positionH relativeFrom="column">
                         <wp:posOffset>776605</wp:posOffset>
@@ -2454,11 +2238,11 @@
                 </mc:Choice>
                 <mc:Fallback>
                   <w:pict>
-                    <v:shapetype w14:anchorId="631B8ED6" id="_x0000_t32" coordsize="21600,21600" o:spt="32" o:oned="t" path="m,l21600,21600e" filled="f">
-                      <v:path arrowok="t" fillok="f" o:connecttype="none"/>
+                    <v:shapetype id="_x0000_t32" coordsize="21600,21600" o:oned="t" filled="f" o:spt="32" path="m,l21600,21600e" w14:anchorId="631B8ED6">
+                      <v:path fillok="f" arrowok="t" o:connecttype="none"/>
                       <o:lock v:ext="edit" shapetype="t"/>
                     </v:shapetype>
-                    <v:shape id="Straight Arrow Connector 1977137422" o:spid="_x0000_s1026" type="#_x0000_t32" style="position:absolute;margin-left:61.15pt;margin-top:19.7pt;width:132pt;height:0;z-index:251667456;visibility:visible;mso-wrap-style:square;mso-width-percent:0;mso-height-percent:0;mso-wrap-distance-left:9pt;mso-wrap-distance-top:-6e-5mm;mso-wrap-distance-right:9pt;mso-wrap-distance-bottom:-6e-5mm;mso-position-horizontal:absolute;mso-position-horizontal-relative:text;mso-position-vertical:absolute;mso-position-vertical-relative:text;mso-width-percent:0;mso-height-percent:0;mso-width-relative:page;mso-height-relative:page" o:gfxdata="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"/>
+                    <v:shape id="Straight Arrow Connector 1977137422" style="position:absolute;margin-left:61.15pt;margin-top:19.7pt;width:132pt;height:0;z-index:251667456;visibility:visible;mso-wrap-style:square;mso-width-percent:0;mso-height-percent:0;mso-wrap-distance-left:9pt;mso-wrap-distance-top:-6e-5mm;mso-wrap-distance-right:9pt;mso-wrap-distance-bottom:-6e-5mm;mso-position-horizontal:absolute;mso-position-horizontal-relative:text;mso-position-vertical:absolute;mso-position-vertical-relative:text;mso-width-percent:0;mso-height-percent:0;mso-width-relative:page;mso-height-relative:page" o:spid="_x0000_s1026" type="#_x0000_t32" o:gfxdata="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"/>
                   </w:pict>
                 </mc:Fallback>
               </mc:AlternateContent>
@@ -2502,7 +2286,7 @@
               <mc:AlternateContent>
                 <mc:Choice Requires="wps">
                   <w:drawing>
-                    <wp:anchor distT="4294967294" distB="4294967294" distL="114300" distR="114300" simplePos="0" relativeHeight="251666432" behindDoc="0" locked="0" layoutInCell="1" allowOverlap="1" wp14:anchorId="22E7C71E" wp14:editId="30CE949A">
+                    <wp:anchor distT="4294967294" distB="4294967294" distL="114300" distR="114300" simplePos="0" relativeHeight="251666432" behindDoc="0" locked="0" layoutInCell="1" allowOverlap="1" wp14:editId="30CE949A" wp14:anchorId="22E7C71E">
                       <wp:simplePos x="0" y="0"/>
                       <wp:positionH relativeFrom="column">
                         <wp:posOffset>764540</wp:posOffset>
@@ -2563,7 +2347,7 @@
                 </mc:Choice>
                 <mc:Fallback>
                   <w:pict>
-                    <v:shape w14:anchorId="3582894D" id="Straight Arrow Connector 2093591429" o:spid="_x0000_s1026" type="#_x0000_t32" style="position:absolute;margin-left:60.2pt;margin-top:4.05pt;width:124.8pt;height:0;z-index:251666432;visibility:visible;mso-wrap-style:square;mso-width-percent:0;mso-height-percent:0;mso-wrap-distance-left:9pt;mso-wrap-distance-top:-6e-5mm;mso-wrap-distance-right:9pt;mso-wrap-distance-bottom:-6e-5mm;mso-position-horizontal:absolute;mso-position-horizontal-relative:text;mso-position-vertical:absolute;mso-position-vertical-relative:text;mso-width-percent:0;mso-height-percent:0;mso-width-relative:page;mso-height-relative:page" o:gfxdata="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"/>
+                    <v:shape id="Straight Arrow Connector 2093591429" style="position:absolute;margin-left:60.2pt;margin-top:4.05pt;width:124.8pt;height:0;z-index:251666432;visibility:visible;mso-wrap-style:square;mso-width-percent:0;mso-height-percent:0;mso-wrap-distance-left:9pt;mso-wrap-distance-top:-6e-5mm;mso-wrap-distance-right:9pt;mso-wrap-distance-bottom:-6e-5mm;mso-position-horizontal:absolute;mso-position-horizontal-relative:text;mso-position-vertical:absolute;mso-position-vertical-relative:text;mso-width-percent:0;mso-height-percent:0;mso-width-relative:page;mso-height-relative:page" o:spid="_x0000_s1026" type="#_x0000_t32" o:gfxdata="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" w14:anchorId="3582894D"/>
                   </w:pict>
                 </mc:Fallback>
               </mc:AlternateContent>
@@ -2641,12 +2425,23 @@
       <w:pPr>
         <w:pStyle w:val="NormalWeb"/>
         <w:spacing w:before="0" w:beforeAutospacing="0" w:after="0" w:afterAutospacing="0"/>
-        <w:jc w:val="center"/>
-        <w:rPr>
+        <w:ind w:firstLine="709"/>
+        <w:jc w:val="both"/>
+        <w:rPr>
+          <w:bCs/>
           <w:sz w:val="26"/>
           <w:szCs w:val="26"/>
         </w:rPr>
       </w:pPr>
+      <w:r>
+        <w:rPr>
+          <w:rFonts w:eastAsia="Times New Roman"/>
+          <w:bCs/>
+          <w:sz w:val="26"/>
+          <w:szCs w:val="26"/>
+        </w:rPr>
+        <w:t>Căn cứ vào hợp đồng số {{CONTRACT_NO}} ký ngày {{CONTRACT_DATE}} giữa Trung tâm mạng lưới MobiFone miền Nam và Ông/Bà {{OWNER_NAME}} về việc thuê vị trí đặt trạm điện thoại di động tại: {{ADDRESS_OLD}} (ID trạm: {{SITE_ID}}).</w:t>
+      </w:r>
     </w:p>
     <w:p>
       <w:pPr>
@@ -2655,28 +2450,6 @@
         <w:ind w:firstLine="709"/>
         <w:jc w:val="both"/>
         <w:rPr>
-          <w:bCs/>
-          <w:sz w:val="26"/>
-          <w:szCs w:val="26"/>
-        </w:rPr>
-      </w:pPr>
-      <w:r>
-        <w:rPr>
-          <w:rFonts w:eastAsia="Times New Roman"/>
-          <w:bCs/>
-          <w:sz w:val="26"/>
-          <w:szCs w:val="26"/>
-        </w:rPr>
-        <w:t>Căn cứ vào hợp đồng số {{CONTRACT_NO}} ký ngày {{CONTRACT_DATE}} giữa Trung tâm mạng lưới MobiFone miền Nam và Ông/Bà {{OWNER_NAME}} về việc thuê vị trí đặt trạm điện thoại di động tại: {{ADDRESS_OLD}} (ID trạm: {{SITE_ID}}).</w:t>
-      </w:r>
-    </w:p>
-    <w:p>
-      <w:pPr>
-        <w:pStyle w:val="NormalWeb"/>
-        <w:spacing w:before="0" w:beforeAutospacing="0" w:after="0" w:afterAutospacing="0"/>
-        <w:ind w:firstLine="709"/>
-        <w:jc w:val="both"/>
-        <w:rPr>
           <w:sz w:val="26"/>
           <w:szCs w:val="26"/>
         </w:rPr>
@@ -2694,7 +2467,7 @@
           <w:sz w:val="26"/>
           <w:szCs w:val="26"/>
         </w:rPr>
-        <w:t xml:space="preserve"> Hôm nay, ngày        tháng          năm   202</w:t>
+        <w:t xml:space="preserve"> Hôm nay, ngày        tháng          năm 202</w:t>
       </w:r>
       <w:r>
         <w:rPr>
@@ -2709,14 +2482,14 @@
           <w:sz w:val="26"/>
           <w:szCs w:val="26"/>
         </w:rPr>
-        <w:t xml:space="preserve">  tại </w:t>
+        <w:t xml:space="preserve"> tại</w:t>
       </w:r>
       <w:r>
         <w:rPr>
           <w:sz w:val="26"/>
           <w:szCs w:val="26"/>
         </w:rPr>
-        <w:t xml:space="preserve">tại </w:t>
+        <w:t xml:space="preserve"> </w:t>
       </w:r>
       <w:r>
         <w:rPr>
@@ -2897,8 +2670,8 @@
                 <w:szCs w:val="26"/>
               </w:rPr>
             </w:pPr>
-            <w:bookmarkStart w:id="0" w:name="_Hlk65570467"/>
-            <w:bookmarkStart w:id="1" w:name="_Hlk76457538"/>
+            <w:bookmarkStart w:name="_Hlk65570467" w:id="0"/>
+            <w:bookmarkStart w:name="_Hlk76457538" w:id="1"/>
             <w:r>
               <w:rPr>
                 <w:rFonts w:ascii="Times New Roman" w:hAnsi="Times New Roman"/>
@@ -3049,7 +2822,7 @@
             <w:r>
               <w:rPr>
                 <w:rStyle w:val="Emphasis"/>
-                <w:rFonts w:ascii="Times New Roman" w:eastAsiaTheme="majorEastAsia" w:hAnsi="Times New Roman"/>
+                <w:rFonts w:ascii="Times New Roman" w:hAnsi="Times New Roman" w:eastAsiaTheme="majorEastAsia"/>
                 <w:b/>
                 <w:bCs/>
                 <w:i w:val="0"/>
@@ -3432,17 +3205,6 @@
         <w:t>3/ Biên bản này được lập thành 02 bản, mỗi bên giữ 01 bản có giá trị pháp lý như nhau</w:t>
       </w:r>
     </w:p>
-    <w:p>
-      <w:pPr>
-        <w:spacing w:before="120" w:line="320" w:lineRule="exact"/>
-        <w:jc w:val="both"/>
-        <w:rPr>
-          <w:rFonts w:ascii="Times New Roman" w:hAnsi="Times New Roman"/>
-          <w:sz w:val="28"/>
-          <w:szCs w:val="28"/>
-        </w:rPr>
-      </w:pPr>
-    </w:p>
     <w:tbl>
       <w:tblPr>
         <w:tblW w:w="10440" w:type="dxa"/>
@@ -3498,7 +3260,7 @@
                 <w:rFonts w:ascii="Times New Roman" w:hAnsi="Times New Roman"/>
                 <w:szCs w:val="28"/>
               </w:rPr>
-              <w:t xml:space="preserve">                 </w:t>
+              <w:t xml:space="preserve">             </w:t>
             </w:r>
           </w:p>
           <w:p>
@@ -3682,11 +3444,6 @@
         </w:tc>
       </w:tr>
     </w:tbl>
-    <w:p>
-      <w:r>
-        <w:br w:type="page"/>
-      </w:r>
-    </w:p>
     <w:tbl>
       <w:tblPr>
         <w:tblpPr w:leftFromText="180" w:rightFromText="180" w:vertAnchor="text" w:horzAnchor="margin" w:tblpXSpec="center" w:tblpY="-832"/>
@@ -3800,7 +3557,7 @@
               <mc:AlternateContent>
                 <mc:Choice Requires="wps">
                   <w:drawing>
-                    <wp:anchor distT="4294967294" distB="4294967294" distL="114300" distR="114300" simplePos="0" relativeHeight="251664384" behindDoc="0" locked="0" layoutInCell="1" allowOverlap="1" wp14:anchorId="69335A19" wp14:editId="721454E2">
+                    <wp:anchor distT="4294967294" distB="4294967294" distL="114300" distR="114300" simplePos="0" relativeHeight="251664384" behindDoc="0" locked="0" layoutInCell="1" allowOverlap="1" wp14:editId="721454E2" wp14:anchorId="69335A19">
                       <wp:simplePos x="0" y="0"/>
                       <wp:positionH relativeFrom="column">
                         <wp:posOffset>776605</wp:posOffset>
@@ -3861,7 +3618,7 @@
                 </mc:Choice>
                 <mc:Fallback>
                   <w:pict>
-                    <v:shape w14:anchorId="18EC2693" id="Straight Arrow Connector 4" o:spid="_x0000_s1026" type="#_x0000_t32" style="position:absolute;margin-left:61.15pt;margin-top:19.7pt;width:132pt;height:0;z-index:251664384;visibility:visible;mso-wrap-style:square;mso-width-percent:0;mso-height-percent:0;mso-wrap-distance-left:9pt;mso-wrap-distance-top:-6e-5mm;mso-wrap-distance-right:9pt;mso-wrap-distance-bottom:-6e-5mm;mso-position-horizontal:absolute;mso-position-horizontal-relative:text;mso-position-vertical:absolute;mso-position-vertical-relative:text;mso-width-percent:0;mso-height-percent:0;mso-width-relative:page;mso-height-relative:page" o:gfxdata="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"/>
+                    <v:shape id="Straight Arrow Connector 4" style="position:absolute;margin-left:61.15pt;margin-top:19.7pt;width:132pt;height:0;z-index:251664384;visibility:visible;mso-wrap-style:square;mso-width-percent:0;mso-height-percent:0;mso-wrap-distance-left:9pt;mso-wrap-distance-top:-6e-5mm;mso-wrap-distance-right:9pt;mso-wrap-distance-bottom:-6e-5mm;mso-position-horizontal:absolute;mso-position-horizontal-relative:text;mso-position-vertical:absolute;mso-position-vertical-relative:text;mso-width-percent:0;mso-height-percent:0;mso-width-relative:page;mso-height-relative:page" o:spid="_x0000_s1026" type="#_x0000_t32" o:gfxdata="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" w14:anchorId="18EC2693"/>
                   </w:pict>
                 </mc:Fallback>
               </mc:AlternateContent>
@@ -3905,7 +3662,7 @@
               <mc:AlternateContent>
                 <mc:Choice Requires="wps">
                   <w:drawing>
-                    <wp:anchor distT="4294967294" distB="4294967294" distL="114300" distR="114300" simplePos="0" relativeHeight="251663360" behindDoc="0" locked="0" layoutInCell="1" allowOverlap="1" wp14:anchorId="11096036" wp14:editId="2FBC9FB5">
+                    <wp:anchor distT="4294967294" distB="4294967294" distL="114300" distR="114300" simplePos="0" relativeHeight="251663360" behindDoc="0" locked="0" layoutInCell="1" allowOverlap="1" wp14:editId="2FBC9FB5" wp14:anchorId="11096036">
                       <wp:simplePos x="0" y="0"/>
                       <wp:positionH relativeFrom="column">
                         <wp:posOffset>764540</wp:posOffset>
@@ -3966,7 +3723,7 @@
                 </mc:Choice>
                 <mc:Fallback>
                   <w:pict>
-                    <v:shape w14:anchorId="0680D1E1" id="Straight Arrow Connector 5" o:spid="_x0000_s1026" type="#_x0000_t32" style="position:absolute;margin-left:60.2pt;margin-top:4.05pt;width:124.8pt;height:0;z-index:251663360;visibility:visible;mso-wrap-style:square;mso-width-percent:0;mso-height-percent:0;mso-wrap-distance-left:9pt;mso-wrap-distance-top:-6e-5mm;mso-wrap-distance-right:9pt;mso-wrap-distance-bottom:-6e-5mm;mso-position-horizontal:absolute;mso-position-horizontal-relative:text;mso-position-vertical:absolute;mso-position-vertical-relative:text;mso-width-percent:0;mso-height-percent:0;mso-width-relative:page;mso-height-relative:page" o:gfxdata="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"/>
+                    <v:shape id="Straight Arrow Connector 5" style="position:absolute;margin-left:60.2pt;margin-top:4.05pt;width:124.8pt;height:0;z-index:251663360;visibility:visible;mso-wrap-style:square;mso-width-percent:0;mso-height-percent:0;mso-wrap-distance-left:9pt;mso-wrap-distance-top:-6e-5mm;mso-wrap-distance-right:9pt;mso-wrap-distance-bottom:-6e-5mm;mso-position-horizontal:absolute;mso-position-horizontal-relative:text;mso-position-vertical:absolute;mso-position-vertical-relative:text;mso-width-percent:0;mso-height-percent:0;mso-width-relative:page;mso-height-relative:page" o:spid="_x0000_s1026" type="#_x0000_t32" o:gfxdata="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" w14:anchorId="0680D1E1"/>
                   </w:pict>
                 </mc:Fallback>
               </mc:AlternateContent>
@@ -4050,7 +3807,7 @@
       </w:r>
       <w:r>
         <w:rPr>
-          <w:rFonts w:ascii="Times New Roman" w:eastAsiaTheme="majorEastAsia" w:hAnsi="Times New Roman"/>
+          <w:rFonts w:ascii="Times New Roman" w:hAnsi="Times New Roman" w:eastAsiaTheme="majorEastAsia"/>
           <w:szCs w:val="26"/>
         </w:rPr>
         <w:t xml:space="preserve"> </w:t>
@@ -4139,7 +3896,7 @@
           <w:lang w:val="vi-VN"/>
         </w:rPr>
       </w:pPr>
-      <w:bookmarkStart w:id="2" w:name="_Hlk76390970"/>
+      <w:bookmarkStart w:name="_Hlk76390970" w:id="2"/>
       <w:r>
         <w:rPr>
           <w:rFonts w:ascii="Times New Roman" w:hAnsi="Times New Roman"/>
@@ -4153,7 +3910,7 @@
       <w:bookmarkEnd w:id="2"/>
       <w:r>
         <w:rPr>
-          <w:rFonts w:ascii="Times New Roman" w:eastAsiaTheme="minorEastAsia" w:hAnsi="Times New Roman"/>
+          <w:rFonts w:ascii="Times New Roman" w:hAnsi="Times New Roman" w:eastAsiaTheme="minorEastAsia"/>
           <w:bCs/>
           <w:i/>
           <w:szCs w:val="26"/>
@@ -4163,7 +3920,7 @@
       </w:r>
       <w:r>
         <w:rPr>
-          <w:rFonts w:ascii="Times New Roman" w:eastAsiaTheme="minorEastAsia" w:hAnsi="Times New Roman"/>
+          <w:rFonts w:ascii="Times New Roman" w:hAnsi="Times New Roman" w:eastAsiaTheme="minorEastAsia"/>
           <w:b/>
           <w:i/>
           <w:szCs w:val="26"/>
@@ -4171,19 +3928,6 @@
         </w:rPr>
         <w:t>HĐ-MBF.ĐNa-VT</w:t>
       </w:r>
-    </w:p>
-    <w:p>
-      <w:pPr>
-        <w:widowControl w:val="0"/>
-        <w:jc w:val="center"/>
-        <w:rPr>
-          <w:rFonts w:ascii="Times New Roman" w:hAnsi="Times New Roman"/>
-          <w:b/>
-          <w:bCs/>
-          <w:szCs w:val="26"/>
-          <w:lang w:val="vi-VN"/>
-        </w:rPr>
-      </w:pPr>
     </w:p>
     <w:p>
       <w:pPr>
@@ -4580,7 +4324,7 @@
           <w:rFonts w:ascii="Times New Roman" w:hAnsi="Times New Roman"/>
           <w:szCs w:val="26"/>
         </w:rPr>
-        <w:t xml:space="preserve">Điện thọai   </w:t>
+        <w:t xml:space="preserve">Điện thoại </w:t>
       </w:r>
       <w:r>
         <w:rPr>
@@ -4795,7 +4539,7 @@
       <w:r>
         <w:rPr>
           <w:rStyle w:val="Emphasis"/>
-          <w:rFonts w:ascii="Times New Roman" w:eastAsiaTheme="majorEastAsia" w:hAnsi="Times New Roman"/>
+          <w:rFonts w:ascii="Times New Roman" w:hAnsi="Times New Roman" w:eastAsiaTheme="majorEastAsia"/>
           <w:b/>
           <w:bCs/>
           <w:i w:val="0"/>
@@ -5438,25 +5182,6 @@
         <w:jc w:val="both"/>
         <w:rPr>
           <w:rFonts w:ascii="Times New Roman" w:hAnsi="Times New Roman"/>
-          <w:iCs/>
-          <w:szCs w:val="26"/>
-          <w:lang w:val="da-DK"/>
-        </w:rPr>
-      </w:pPr>
-    </w:p>
-    <w:p>
-      <w:pPr>
-        <w:widowControl w:val="0"/>
-        <w:tabs>
-          <w:tab w:val="left" w:pos="993"/>
-        </w:tabs>
-        <w:autoSpaceDE w:val="0"/>
-        <w:autoSpaceDN w:val="0"/>
-        <w:spacing w:before="60" w:after="60"/>
-        <w:ind w:left="720"/>
-        <w:jc w:val="both"/>
-        <w:rPr>
-          <w:rFonts w:ascii="Times New Roman" w:hAnsi="Times New Roman"/>
           <w:szCs w:val="26"/>
           <w:lang w:val="da-DK"/>
         </w:rPr>
@@ -5560,7 +5285,7 @@
           <w:szCs w:val="26"/>
           <w:lang w:val="da-DK"/>
         </w:rPr>
-        <w:t xml:space="preserve">Bên A đồng ý cho Bên B sử dụng mặt bằng, cở sở hạ tầng trạm BTS như trên để triển khai lắp đặt các thiết bị trạm thông tin di động và khai thác hạ tầng các mạng thông tin, truyền thông theo đúng quy định của pháp luật. </w:t>
+        <w:t xml:space="preserve">Bên A đồng ý cho Bên B sử dụng mặt bằng, cơ sở hạ tầng trạm BTS như trên để triển khai lắp đặt các thiết bị trạm thông tin di động và khai thác hạ tầng các mạng thông tin, truyền thông theo đúng quy định của pháp luật. </w:t>
       </w:r>
     </w:p>
     <w:p>
@@ -5899,7 +5624,7 @@
           <w:sz w:val="26"/>
           <w:szCs w:val="26"/>
         </w:rPr>
-        <w:t xml:space="preserve">  1. Thời hạn thuê: Từ ngày {{START_DATE}} đến ngày </w:t>
+        <w:t xml:space="preserve"> 1. Thời hạn thuê: Từ ngày {{START_DATE}} đến ngày </w:t>
       </w:r>
       <w:r>
         <w:rPr>
@@ -6283,7 +6008,7 @@
           <w:szCs w:val="26"/>
           <w:lang w:val="vi-VN"/>
         </w:rPr>
-        <w:t>Trường hợp thay đổi thông tin tài khoản nhận thanh toán, Bên B phải báo trước bằng văn bản cho bên A chậm nhất là 30 ngày trước khi đến hạn của chu kỳ thanh toán kế tiếp và hai bên sẽ tiến hành ký phụ lục điều chỉnh thông tin tài khoản nhận tiền  thanh toán.</w:t>
+        <w:t>Trường hợp thay đổi thông tin tài khoản nhận thanh toán, Bên B phải báo trước bằng văn bản cho bên A chậm nhất là 30 ngày trước khi đến hạn của chu kỳ thanh toán kế tiếp và hai bên sẽ tiến hành ký phụ lục điều chỉnh thông tin tài khoản nhận tiền thanh toán.</w:t>
       </w:r>
     </w:p>
     <w:p>
@@ -6433,19 +6158,6 @@
         </w:rPr>
         <w:t>thể:</w:t>
       </w:r>
-    </w:p>
-    <w:p>
-      <w:pPr>
-        <w:pStyle w:val="ListParagraph"/>
-        <w:spacing w:before="120" w:line="320" w:lineRule="exact"/>
-        <w:jc w:val="both"/>
-        <w:rPr>
-          <w:rFonts w:ascii="Times New Roman" w:hAnsi="Times New Roman"/>
-          <w:i/>
-          <w:szCs w:val="26"/>
-          <w:lang w:val="en-SG"/>
-        </w:rPr>
-      </w:pPr>
     </w:p>
     <w:tbl>
       <w:tblPr>
@@ -6486,22 +6198,6 @@
     <w:p>
       <w:pPr>
         <w:widowControl w:val="0"/>
-        <w:spacing w:before="120" w:line="360" w:lineRule="atLeast"/>
-        <w:ind w:firstLine="720"/>
-        <w:jc w:val="both"/>
-        <w:rPr>
-          <w:rFonts w:ascii="Times New Roman" w:hAnsi="Times New Roman"/>
-          <w:bCs/>
-          <w:iCs/>
-          <w:spacing w:val="-2"/>
-          <w:szCs w:val="26"/>
-          <w:lang w:val="da-DK"/>
-        </w:rPr>
-      </w:pPr>
-    </w:p>
-    <w:p>
-      <w:pPr>
-        <w:widowControl w:val="0"/>
         <w:spacing w:before="120"/>
         <w:ind w:firstLine="720"/>
         <w:jc w:val="both"/>
@@ -6635,7 +6331,7 @@
         <w:tab/>
         <w:t xml:space="preserve">: </w:t>
       </w:r>
-      <w:bookmarkStart w:id="3" w:name="_Hlk220074608"/>
+      <w:bookmarkStart w:name="_Hlk220074608" w:id="3"/>
       <w:r>
         <w:rPr>
           <w:rFonts w:ascii="Times New Roman" w:hAnsi="Times New Roman"/>
@@ -7309,7 +7005,7 @@
           <w:szCs w:val="26"/>
           <w:lang w:val="da-DK"/>
         </w:rPr>
-        <w:t xml:space="preserve"> -    Cho bên B đặt đồng hồ điện kế trong nhà và có trách nhiệm trông coi điện kế, hỗ trợ điện lực ghi chỉ số điện hàng tháng. Bên A không được sử dụng nguồn điện cấp cho trạm BTS cho mục đích sử dụng riêng. Tuyệt đối không được phép tự ý ngắt, cúp cầu dao, CB… làm mất điện lưới của trạm. Nếu vi phạm sẽ bị xử phạt theo quy định về đảm bảo an toàn thông tin liên lac và tần số vô tuyến điện, </w:t>
+        <w:t xml:space="preserve"> -    Cho bên B đặt đồng hồ điện kế trong nhà và có trách nhiệm trông coi điện kế, hỗ trợ điện lực ghi chỉ số điện hàng tháng. Bên A không được sử dụng nguồn điện cấp cho trạm BTS cho mục đích sử dụng riêng. Tuyệt đối không được phép tự ý ngắt, cúp cầu dao, CB… làm mất điện lưới của trạm. Nếu vi phạm sẽ bị xử phạt theo quy định về đảm bảo an toàn thông tin liên lạc và tần số vô tuyến điện, </w:t>
       </w:r>
       <w:r>
         <w:rPr>
@@ -7436,7 +7132,7 @@
           <w:szCs w:val="26"/>
           <w:lang w:val="vi-VN"/>
         </w:rPr>
-        <w:t xml:space="preserve"> quản lý, sữa chữa, bảo dưỡng định kỳ các hạng mục cơ sở hạ tầng cho thuê </w:t>
+        <w:t xml:space="preserve"> quản lý, sửa chữa, bảo dưỡng định kỳ các hạng mục cơ sở hạ tầng cho thuê </w:t>
       </w:r>
       <w:r>
         <w:rPr>
@@ -7459,23 +7155,6 @@
         </w:rPr>
         <w:t xml:space="preserve"> theo tần suất trung bình tối thiểu như sau:</w:t>
       </w:r>
-    </w:p>
-    <w:p>
-      <w:pPr>
-        <w:pStyle w:val="BodyTextIndent3"/>
-        <w:tabs>
-          <w:tab w:val="left" w:pos="993"/>
-        </w:tabs>
-        <w:spacing w:before="60" w:after="60" w:line="276" w:lineRule="auto"/>
-        <w:ind w:left="720"/>
-        <w:rPr>
-          <w:rFonts w:ascii="Times New Roman" w:hAnsi="Times New Roman"/>
-          <w:spacing w:val="-2"/>
-          <w:sz w:val="26"/>
-          <w:szCs w:val="26"/>
-          <w:lang w:val="vi-VN"/>
-        </w:rPr>
-      </w:pPr>
     </w:p>
     <w:tbl>
       <w:tblPr>
@@ -7500,10 +7179,10 @@
             <w:tcW w:w="9067" w:type="dxa"/>
             <w:gridSpan w:val="4"/>
             <w:tcBorders>
-              <w:top w:val="single" w:sz="4" w:space="0" w:color="auto"/>
-              <w:left w:val="single" w:sz="4" w:space="0" w:color="auto"/>
-              <w:bottom w:val="single" w:sz="4" w:space="0" w:color="auto"/>
-              <w:right w:val="single" w:sz="4" w:space="0" w:color="auto"/>
+              <w:top w:val="single" w:color="auto" w:sz="4" w:space="0"/>
+              <w:left w:val="single" w:color="auto" w:sz="4" w:space="0"/>
+              <w:bottom w:val="single" w:color="auto" w:sz="4" w:space="0"/>
+              <w:right w:val="single" w:color="auto" w:sz="4" w:space="0"/>
             </w:tcBorders>
             <w:noWrap/>
             <w:vAlign w:val="center"/>
@@ -7540,10 +7219,10 @@
           <w:tcPr>
             <w:tcW w:w="851" w:type="dxa"/>
             <w:tcBorders>
-              <w:top w:val="single" w:sz="4" w:space="0" w:color="auto"/>
-              <w:left w:val="single" w:sz="4" w:space="0" w:color="auto"/>
-              <w:bottom w:val="single" w:sz="4" w:space="0" w:color="auto"/>
-              <w:right w:val="single" w:sz="4" w:space="0" w:color="auto"/>
+              <w:top w:val="single" w:color="auto" w:sz="4" w:space="0"/>
+              <w:left w:val="single" w:color="auto" w:sz="4" w:space="0"/>
+              <w:bottom w:val="single" w:color="auto" w:sz="4" w:space="0"/>
+              <w:right w:val="single" w:color="auto" w:sz="4" w:space="0"/>
             </w:tcBorders>
             <w:noWrap/>
             <w:vAlign w:val="center"/>
@@ -7572,10 +7251,10 @@
           <w:tcPr>
             <w:tcW w:w="3260" w:type="dxa"/>
             <w:tcBorders>
-              <w:top w:val="single" w:sz="4" w:space="0" w:color="auto"/>
+              <w:top w:val="single" w:color="auto" w:sz="4" w:space="0"/>
               <w:left w:val="nil"/>
-              <w:bottom w:val="single" w:sz="4" w:space="0" w:color="auto"/>
-              <w:right w:val="single" w:sz="4" w:space="0" w:color="auto"/>
+              <w:bottom w:val="single" w:color="auto" w:sz="4" w:space="0"/>
+              <w:right w:val="single" w:color="auto" w:sz="4" w:space="0"/>
             </w:tcBorders>
             <w:noWrap/>
             <w:vAlign w:val="center"/>
@@ -7604,10 +7283,10 @@
           <w:tcPr>
             <w:tcW w:w="2410" w:type="dxa"/>
             <w:tcBorders>
-              <w:top w:val="single" w:sz="4" w:space="0" w:color="auto"/>
+              <w:top w:val="single" w:color="auto" w:sz="4" w:space="0"/>
               <w:left w:val="nil"/>
-              <w:bottom w:val="single" w:sz="4" w:space="0" w:color="auto"/>
-              <w:right w:val="single" w:sz="4" w:space="0" w:color="auto"/>
+              <w:bottom w:val="single" w:color="auto" w:sz="4" w:space="0"/>
+              <w:right w:val="single" w:color="auto" w:sz="4" w:space="0"/>
             </w:tcBorders>
             <w:noWrap/>
             <w:vAlign w:val="center"/>
@@ -7636,10 +7315,10 @@
           <w:tcPr>
             <w:tcW w:w="2546" w:type="dxa"/>
             <w:tcBorders>
-              <w:top w:val="single" w:sz="4" w:space="0" w:color="auto"/>
+              <w:top w:val="single" w:color="auto" w:sz="4" w:space="0"/>
               <w:left w:val="nil"/>
-              <w:bottom w:val="single" w:sz="4" w:space="0" w:color="auto"/>
-              <w:right w:val="single" w:sz="4" w:space="0" w:color="auto"/>
+              <w:bottom w:val="single" w:color="auto" w:sz="4" w:space="0"/>
+              <w:right w:val="single" w:color="auto" w:sz="4" w:space="0"/>
             </w:tcBorders>
             <w:noWrap/>
             <w:vAlign w:val="center"/>
@@ -7673,9 +7352,9 @@
             <w:tcW w:w="851" w:type="dxa"/>
             <w:tcBorders>
               <w:top w:val="nil"/>
-              <w:left w:val="single" w:sz="4" w:space="0" w:color="auto"/>
-              <w:bottom w:val="single" w:sz="4" w:space="0" w:color="auto"/>
-              <w:right w:val="single" w:sz="4" w:space="0" w:color="auto"/>
+              <w:left w:val="single" w:color="auto" w:sz="4" w:space="0"/>
+              <w:bottom w:val="single" w:color="auto" w:sz="4" w:space="0"/>
+              <w:right w:val="single" w:color="auto" w:sz="4" w:space="0"/>
             </w:tcBorders>
             <w:noWrap/>
             <w:vAlign w:val="center"/>
@@ -7704,10 +7383,10 @@
           <w:tcPr>
             <w:tcW w:w="3260" w:type="dxa"/>
             <w:tcBorders>
-              <w:top w:val="single" w:sz="4" w:space="0" w:color="auto"/>
+              <w:top w:val="single" w:color="auto" w:sz="4" w:space="0"/>
               <w:left w:val="nil"/>
-              <w:bottom w:val="single" w:sz="4" w:space="0" w:color="auto"/>
-              <w:right w:val="single" w:sz="4" w:space="0" w:color="000000"/>
+              <w:bottom w:val="single" w:color="auto" w:sz="4" w:space="0"/>
+              <w:right w:val="single" w:color="000000" w:sz="4" w:space="0"/>
             </w:tcBorders>
             <w:noWrap/>
             <w:vAlign w:val="center"/>
@@ -7735,10 +7414,10 @@
           <w:tcPr>
             <w:tcW w:w="2410" w:type="dxa"/>
             <w:tcBorders>
-              <w:top w:val="single" w:sz="4" w:space="0" w:color="auto"/>
+              <w:top w:val="single" w:color="auto" w:sz="4" w:space="0"/>
               <w:left w:val="nil"/>
-              <w:bottom w:val="single" w:sz="4" w:space="0" w:color="auto"/>
-              <w:right w:val="single" w:sz="4" w:space="0" w:color="auto"/>
+              <w:bottom w:val="single" w:color="auto" w:sz="4" w:space="0"/>
+              <w:right w:val="single" w:color="auto" w:sz="4" w:space="0"/>
             </w:tcBorders>
             <w:noWrap/>
             <w:vAlign w:val="center"/>
@@ -7766,10 +7445,10 @@
             <w:tcW w:w="2546" w:type="dxa"/>
             <w:vMerge w:val="restart"/>
             <w:tcBorders>
-              <w:top w:val="single" w:sz="4" w:space="0" w:color="auto"/>
-              <w:left w:val="single" w:sz="4" w:space="0" w:color="auto"/>
-              <w:bottom w:val="single" w:sz="4" w:space="0" w:color="auto"/>
-              <w:right w:val="single" w:sz="4" w:space="0" w:color="auto"/>
+              <w:top w:val="single" w:color="auto" w:sz="4" w:space="0"/>
+              <w:left w:val="single" w:color="auto" w:sz="4" w:space="0"/>
+              <w:bottom w:val="single" w:color="auto" w:sz="4" w:space="0"/>
+              <w:right w:val="single" w:color="auto" w:sz="4" w:space="0"/>
             </w:tcBorders>
             <w:noWrap/>
             <w:vAlign w:val="center"/>
@@ -7802,10 +7481,10 @@
           <w:tcPr>
             <w:tcW w:w="851" w:type="dxa"/>
             <w:tcBorders>
-              <w:top w:val="single" w:sz="4" w:space="0" w:color="auto"/>
-              <w:left w:val="single" w:sz="4" w:space="0" w:color="auto"/>
-              <w:bottom w:val="single" w:sz="4" w:space="0" w:color="auto"/>
-              <w:right w:val="single" w:sz="4" w:space="0" w:color="auto"/>
+              <w:top w:val="single" w:color="auto" w:sz="4" w:space="0"/>
+              <w:left w:val="single" w:color="auto" w:sz="4" w:space="0"/>
+              <w:bottom w:val="single" w:color="auto" w:sz="4" w:space="0"/>
+              <w:right w:val="single" w:color="auto" w:sz="4" w:space="0"/>
             </w:tcBorders>
             <w:noWrap/>
             <w:vAlign w:val="center"/>
@@ -7834,10 +7513,10 @@
           <w:tcPr>
             <w:tcW w:w="3260" w:type="dxa"/>
             <w:tcBorders>
-              <w:top w:val="single" w:sz="4" w:space="0" w:color="auto"/>
+              <w:top w:val="single" w:color="auto" w:sz="4" w:space="0"/>
               <w:left w:val="nil"/>
-              <w:bottom w:val="single" w:sz="4" w:space="0" w:color="auto"/>
-              <w:right w:val="single" w:sz="4" w:space="0" w:color="000000"/>
+              <w:bottom w:val="single" w:color="auto" w:sz="4" w:space="0"/>
+              <w:right w:val="single" w:color="000000" w:sz="4" w:space="0"/>
             </w:tcBorders>
             <w:noWrap/>
             <w:vAlign w:val="center"/>
@@ -7864,10 +7543,10 @@
           <w:tcPr>
             <w:tcW w:w="2410" w:type="dxa"/>
             <w:tcBorders>
-              <w:top w:val="single" w:sz="4" w:space="0" w:color="auto"/>
+              <w:top w:val="single" w:color="auto" w:sz="4" w:space="0"/>
               <w:left w:val="nil"/>
-              <w:bottom w:val="single" w:sz="4" w:space="0" w:color="auto"/>
-              <w:right w:val="single" w:sz="4" w:space="0" w:color="auto"/>
+              <w:bottom w:val="single" w:color="auto" w:sz="4" w:space="0"/>
+              <w:right w:val="single" w:color="auto" w:sz="4" w:space="0"/>
             </w:tcBorders>
             <w:noWrap/>
             <w:vAlign w:val="center"/>
@@ -7895,9 +7574,9 @@
             <w:tcW w:w="2546" w:type="dxa"/>
             <w:vMerge/>
             <w:tcBorders>
-              <w:left w:val="single" w:sz="4" w:space="0" w:color="auto"/>
-              <w:bottom w:val="single" w:sz="4" w:space="0" w:color="auto"/>
-              <w:right w:val="single" w:sz="4" w:space="0" w:color="auto"/>
+              <w:left w:val="single" w:color="auto" w:sz="4" w:space="0"/>
+              <w:bottom w:val="single" w:color="auto" w:sz="4" w:space="0"/>
+              <w:right w:val="single" w:color="auto" w:sz="4" w:space="0"/>
             </w:tcBorders>
             <w:noWrap/>
             <w:vAlign w:val="center"/>
@@ -7914,25 +7593,6 @@
         </w:tc>
       </w:tr>
     </w:tbl>
-    <w:p>
-      <w:pPr>
-        <w:pStyle w:val="ListParagraph"/>
-        <w:keepNext/>
-        <w:tabs>
-          <w:tab w:val="left" w:pos="851"/>
-        </w:tabs>
-        <w:spacing w:before="60" w:after="60" w:line="276" w:lineRule="auto"/>
-        <w:ind w:left="1080"/>
-        <w:jc w:val="both"/>
-        <w:rPr>
-          <w:rFonts w:ascii="Times New Roman" w:hAnsi="Times New Roman"/>
-          <w:b/>
-          <w:bCs/>
-          <w:szCs w:val="26"/>
-          <w:lang w:val="da-DK"/>
-        </w:rPr>
-      </w:pPr>
-    </w:p>
     <w:p>
       <w:pPr>
         <w:pStyle w:val="ListParagraph"/>
@@ -8504,7 +8164,7 @@
           <w:szCs w:val="26"/>
           <w:lang w:val="da-DK"/>
         </w:rPr>
-        <w:t>Bên B không chịu bất cứ trách nhiệm gì về những phát sinh ngoài hợp đồng đã ký với bên A.</w:t>
+        <w:t xml:space="preserve">Bên B không chịu bất cứ trách nhiệm gì về những phát sinh ngoài hợp đồng đã ký với Bên A. Điều 5</w:t>
       </w:r>
       <w:r>
         <w:rPr>
@@ -8516,7 +8176,7 @@
           <w:szCs w:val="26"/>
           <w:lang w:val="vi-VN"/>
         </w:rPr>
-        <w:t>Điều 5.  Giải quyết các sự kiện bất khả kháng và các sự kiện khách quan khác;</w:t>
+        <w:t xml:space="preserve">. Giải quyết các sự kiện bất khả kháng và các sự kiện khách quan khác;</w:t>
       </w:r>
       <w:r>
         <w:rPr>
@@ -8529,7 +8189,7 @@
         </w:rPr>
         <w:t xml:space="preserve"> </w:t>
       </w:r>
-      <w:bookmarkStart w:id="4" w:name="_Hlk17185995"/>
+      <w:bookmarkStart w:name="_Hlk17185995" w:id="4"/>
       <w:r>
         <w:rPr>
           <w:rFonts w:ascii="Times New Roman" w:hAnsi="Times New Roman"/>
@@ -9553,7 +9213,7 @@
           <w:szCs w:val="26"/>
           <w:lang w:val="vi-VN"/>
         </w:rPr>
-        <w:t>.  Điều khoản chung</w:t>
+        <w:t>. Điều khoản chung</w:t>
       </w:r>
     </w:p>
     <w:p>
@@ -10266,35 +9926,6 @@
         </w:tc>
       </w:tr>
     </w:tbl>
-    <w:p>
-      <w:pPr>
-        <w:rPr>
-          <w:rFonts w:ascii="Times New Roman" w:hAnsi="Times New Roman"/>
-          <w:szCs w:val="26"/>
-        </w:rPr>
-      </w:pPr>
-    </w:p>
-    <w:p>
-      <w:pPr>
-        <w:rPr>
-          <w:szCs w:val="26"/>
-        </w:rPr>
-      </w:pPr>
-    </w:p>
-    <w:p>
-      <w:pPr>
-        <w:rPr>
-          <w:szCs w:val="26"/>
-        </w:rPr>
-      </w:pPr>
-    </w:p>
-    <w:p>
-      <w:pPr>
-        <w:rPr>
-          <w:szCs w:val="26"/>
-        </w:rPr>
-      </w:pPr>
-    </w:p>
     <w:sectPr>
       <w:pgSz w:w="11906" w:h="16838"/>
       <w:pgMar w:top="1260" w:right="1440" w:bottom="1440" w:left="1440" w:header="708" w:footer="708" w:gutter="0"/>
@@ -10321,7 +9952,7 @@
         </w:tabs>
       </w:pPr>
       <w:rPr>
-        <w:rFonts w:ascii="Times New Roman" w:hAnsi="Times New Roman" w:cs="Times New Roman" w:hint="default"/>
+        <w:rFonts w:hint="default" w:ascii="Times New Roman" w:hAnsi="Times New Roman" w:cs="Times New Roman"/>
       </w:rPr>
     </w:lvl>
     <w:lvl w:ilvl="1" w:tplc="04090003">
@@ -10336,7 +9967,7 @@
         <w:ind w:left="1440" w:hanging="360"/>
       </w:pPr>
       <w:rPr>
-        <w:rFonts w:ascii="Courier New" w:hAnsi="Courier New" w:hint="default"/>
+        <w:rFonts w:hint="default" w:ascii="Courier New" w:hAnsi="Courier New"/>
       </w:rPr>
     </w:lvl>
     <w:lvl w:ilvl="2" w:tplc="04090005">
@@ -10351,7 +9982,7 @@
         <w:ind w:left="2160" w:hanging="360"/>
       </w:pPr>
       <w:rPr>
-        <w:rFonts w:ascii="Wingdings" w:hAnsi="Wingdings" w:hint="default"/>
+        <w:rFonts w:hint="default" w:ascii="Wingdings" w:hAnsi="Wingdings"/>
       </w:rPr>
     </w:lvl>
     <w:lvl w:ilvl="3" w:tplc="04090001">
@@ -10366,7 +9997,7 @@
         <w:ind w:left="2880" w:hanging="360"/>
       </w:pPr>
       <w:rPr>
-        <w:rFonts w:ascii="Symbol" w:hAnsi="Symbol" w:hint="default"/>
+        <w:rFonts w:hint="default" w:ascii="Symbol" w:hAnsi="Symbol"/>
       </w:rPr>
     </w:lvl>
     <w:lvl w:ilvl="4" w:tplc="04090003">
@@ -10381,7 +10012,7 @@
         <w:ind w:left="3600" w:hanging="360"/>
       </w:pPr>
       <w:rPr>
-        <w:rFonts w:ascii="Courier New" w:hAnsi="Courier New" w:hint="default"/>
+        <w:rFonts w:hint="default" w:ascii="Courier New" w:hAnsi="Courier New"/>
       </w:rPr>
     </w:lvl>
     <w:lvl w:ilvl="5" w:tplc="04090005">
@@ -10396,7 +10027,7 @@
         <w:ind w:left="4320" w:hanging="360"/>
       </w:pPr>
       <w:rPr>
-        <w:rFonts w:ascii="Wingdings" w:hAnsi="Wingdings" w:hint="default"/>
+        <w:rFonts w:hint="default" w:ascii="Wingdings" w:hAnsi="Wingdings"/>
       </w:rPr>
     </w:lvl>
     <w:lvl w:ilvl="6" w:tplc="04090001">
@@ -10411,7 +10042,7 @@
         <w:ind w:left="5040" w:hanging="360"/>
       </w:pPr>
       <w:rPr>
-        <w:rFonts w:ascii="Symbol" w:hAnsi="Symbol" w:hint="default"/>
+        <w:rFonts w:hint="default" w:ascii="Symbol" w:hAnsi="Symbol"/>
       </w:rPr>
     </w:lvl>
     <w:lvl w:ilvl="7" w:tplc="04090003">
@@ -10426,7 +10057,7 @@
         <w:ind w:left="5760" w:hanging="360"/>
       </w:pPr>
       <w:rPr>
-        <w:rFonts w:ascii="Courier New" w:hAnsi="Courier New" w:hint="default"/>
+        <w:rFonts w:hint="default" w:ascii="Courier New" w:hAnsi="Courier New"/>
       </w:rPr>
     </w:lvl>
     <w:lvl w:ilvl="8" w:tplc="04090005">
@@ -10441,7 +10072,7 @@
         <w:ind w:left="6480" w:hanging="360"/>
       </w:pPr>
       <w:rPr>
-        <w:rFonts w:ascii="Wingdings" w:hAnsi="Wingdings" w:hint="default"/>
+        <w:rFonts w:hint="default" w:ascii="Wingdings" w:hAnsi="Wingdings"/>
       </w:rPr>
     </w:lvl>
   </w:abstractNum>
@@ -10457,7 +10088,7 @@
         <w:ind w:left="720" w:hanging="360"/>
       </w:pPr>
       <w:rPr>
-        <w:rFonts w:ascii="Times New Roman" w:eastAsia="Calibri" w:hAnsi="Times New Roman" w:cs="Times New Roman" w:hint="default"/>
+        <w:rFonts w:hint="default" w:ascii="Times New Roman" w:hAnsi="Times New Roman" w:eastAsia="Calibri" w:cs="Times New Roman"/>
       </w:rPr>
     </w:lvl>
     <w:lvl w:ilvl="1" w:tplc="04090003" w:tentative="1">
@@ -10469,7 +10100,7 @@
         <w:ind w:left="1440" w:hanging="360"/>
       </w:pPr>
       <w:rPr>
-        <w:rFonts w:ascii="Courier New" w:hAnsi="Courier New" w:cs="Courier New" w:hint="default"/>
+        <w:rFonts w:hint="default" w:ascii="Courier New" w:hAnsi="Courier New" w:cs="Courier New"/>
       </w:rPr>
     </w:lvl>
     <w:lvl w:ilvl="2" w:tplc="04090005" w:tentative="1">
@@ -10481,7 +10112,7 @@
         <w:ind w:left="2160" w:hanging="360"/>
       </w:pPr>
       <w:rPr>
-        <w:rFonts w:ascii="Wingdings" w:hAnsi="Wingdings" w:hint="default"/>
+        <w:rFonts w:hint="default" w:ascii="Wingdings" w:hAnsi="Wingdings"/>
       </w:rPr>
     </w:lvl>
     <w:lvl w:ilvl="3" w:tplc="04090001" w:tentative="1">
@@ -10493,7 +10124,7 @@
         <w:ind w:left="2880" w:hanging="360"/>
       </w:pPr>
       <w:rPr>
-        <w:rFonts w:ascii="Symbol" w:hAnsi="Symbol" w:hint="default"/>
+        <w:rFonts w:hint="default" w:ascii="Symbol" w:hAnsi="Symbol"/>
       </w:rPr>
     </w:lvl>
     <w:lvl w:ilvl="4" w:tplc="04090003" w:tentative="1">
@@ -10505,7 +10136,7 @@
         <w:ind w:left="3600" w:hanging="360"/>
       </w:pPr>
       <w:rPr>
-        <w:rFonts w:ascii="Courier New" w:hAnsi="Courier New" w:cs="Courier New" w:hint="default"/>
+        <w:rFonts w:hint="default" w:ascii="Courier New" w:hAnsi="Courier New" w:cs="Courier New"/>
       </w:rPr>
     </w:lvl>
     <w:lvl w:ilvl="5" w:tplc="04090005" w:tentative="1">
@@ -10517,7 +10148,7 @@
         <w:ind w:left="4320" w:hanging="360"/>
       </w:pPr>
       <w:rPr>
-        <w:rFonts w:ascii="Wingdings" w:hAnsi="Wingdings" w:hint="default"/>
+        <w:rFonts w:hint="default" w:ascii="Wingdings" w:hAnsi="Wingdings"/>
       </w:rPr>
     </w:lvl>
     <w:lvl w:ilvl="6" w:tplc="04090001" w:tentative="1">
@@ -10529,7 +10160,7 @@
         <w:ind w:left="5040" w:hanging="360"/>
       </w:pPr>
       <w:rPr>
-        <w:rFonts w:ascii="Symbol" w:hAnsi="Symbol" w:hint="default"/>
+        <w:rFonts w:hint="default" w:ascii="Symbol" w:hAnsi="Symbol"/>
       </w:rPr>
     </w:lvl>
     <w:lvl w:ilvl="7" w:tplc="04090003" w:tentative="1">
@@ -10541,7 +10172,7 @@
         <w:ind w:left="5760" w:hanging="360"/>
       </w:pPr>
       <w:rPr>
-        <w:rFonts w:ascii="Courier New" w:hAnsi="Courier New" w:cs="Courier New" w:hint="default"/>
+        <w:rFonts w:hint="default" w:ascii="Courier New" w:hAnsi="Courier New" w:cs="Courier New"/>
       </w:rPr>
     </w:lvl>
     <w:lvl w:ilvl="8" w:tplc="04090005" w:tentative="1">
@@ -10553,7 +10184,7 @@
         <w:ind w:left="6480" w:hanging="360"/>
       </w:pPr>
       <w:rPr>
-        <w:rFonts w:ascii="Wingdings" w:hAnsi="Wingdings" w:hint="default"/>
+        <w:rFonts w:hint="default" w:ascii="Wingdings" w:hAnsi="Wingdings"/>
       </w:rPr>
     </w:lvl>
   </w:abstractNum>
@@ -10656,7 +10287,7 @@
         <w:ind w:left="1440" w:hanging="360"/>
       </w:pPr>
       <w:rPr>
-        <w:rFonts w:ascii="Times New Roman" w:eastAsia="Times New Roman" w:hAnsi="Times New Roman" w:cs="Times New Roman" w:hint="default"/>
+        <w:rFonts w:hint="default" w:ascii="Times New Roman" w:hAnsi="Times New Roman" w:eastAsia="Times New Roman" w:cs="Times New Roman"/>
         <w:b w:val="0"/>
         <w:i/>
         <w:sz w:val="18"/>
@@ -10671,7 +10302,7 @@
         <w:ind w:left="2160" w:hanging="360"/>
       </w:pPr>
       <w:rPr>
-        <w:rFonts w:ascii="Courier New" w:hAnsi="Courier New" w:cs="Courier New" w:hint="default"/>
+        <w:rFonts w:hint="default" w:ascii="Courier New" w:hAnsi="Courier New" w:cs="Courier New"/>
       </w:rPr>
     </w:lvl>
     <w:lvl w:ilvl="2" w:tplc="04090005" w:tentative="1">
@@ -10683,7 +10314,7 @@
         <w:ind w:left="2880" w:hanging="360"/>
       </w:pPr>
       <w:rPr>
-        <w:rFonts w:ascii="Wingdings" w:hAnsi="Wingdings" w:hint="default"/>
+        <w:rFonts w:hint="default" w:ascii="Wingdings" w:hAnsi="Wingdings"/>
       </w:rPr>
     </w:lvl>
     <w:lvl w:ilvl="3" w:tplc="04090001" w:tentative="1">
@@ -10695,7 +10326,7 @@
         <w:ind w:left="3600" w:hanging="360"/>
       </w:pPr>
       <w:rPr>
-        <w:rFonts w:ascii="Symbol" w:hAnsi="Symbol" w:hint="default"/>
+        <w:rFonts w:hint="default" w:ascii="Symbol" w:hAnsi="Symbol"/>
       </w:rPr>
     </w:lvl>
     <w:lvl w:ilvl="4" w:tplc="04090003" w:tentative="1">
@@ -10707,7 +10338,7 @@
         <w:ind w:left="4320" w:hanging="360"/>
       </w:pPr>
       <w:rPr>
-        <w:rFonts w:ascii="Courier New" w:hAnsi="Courier New" w:cs="Courier New" w:hint="default"/>
+        <w:rFonts w:hint="default" w:ascii="Courier New" w:hAnsi="Courier New" w:cs="Courier New"/>
       </w:rPr>
     </w:lvl>
     <w:lvl w:ilvl="5" w:tplc="04090005" w:tentative="1">
@@ -10719,7 +10350,7 @@
         <w:ind w:left="5040" w:hanging="360"/>
       </w:pPr>
       <w:rPr>
-        <w:rFonts w:ascii="Wingdings" w:hAnsi="Wingdings" w:hint="default"/>
+        <w:rFonts w:hint="default" w:ascii="Wingdings" w:hAnsi="Wingdings"/>
       </w:rPr>
     </w:lvl>
     <w:lvl w:ilvl="6" w:tplc="04090001" w:tentative="1">
@@ -10731,7 +10362,7 @@
         <w:ind w:left="5760" w:hanging="360"/>
       </w:pPr>
       <w:rPr>
-        <w:rFonts w:ascii="Symbol" w:hAnsi="Symbol" w:hint="default"/>
+        <w:rFonts w:hint="default" w:ascii="Symbol" w:hAnsi="Symbol"/>
       </w:rPr>
     </w:lvl>
     <w:lvl w:ilvl="7" w:tplc="04090003" w:tentative="1">
@@ -10743,7 +10374,7 @@
         <w:ind w:left="6480" w:hanging="360"/>
       </w:pPr>
       <w:rPr>
-        <w:rFonts w:ascii="Courier New" w:hAnsi="Courier New" w:cs="Courier New" w:hint="default"/>
+        <w:rFonts w:hint="default" w:ascii="Courier New" w:hAnsi="Courier New" w:cs="Courier New"/>
       </w:rPr>
     </w:lvl>
     <w:lvl w:ilvl="8" w:tplc="04090005" w:tentative="1">
@@ -10755,7 +10386,7 @@
         <w:ind w:left="7200" w:hanging="360"/>
       </w:pPr>
       <w:rPr>
-        <w:rFonts w:ascii="Wingdings" w:hAnsi="Wingdings" w:hint="default"/>
+        <w:rFonts w:hint="default" w:ascii="Wingdings" w:hAnsi="Wingdings"/>
       </w:rPr>
     </w:lvl>
   </w:abstractNum>
@@ -10857,7 +10488,7 @@
         <w:ind w:left="3763" w:hanging="360"/>
       </w:pPr>
       <w:rPr>
-        <w:rFonts w:ascii="Times New Roman" w:hAnsi="Times New Roman" w:cs="Times New Roman" w:hint="default"/>
+        <w:rFonts w:hint="default" w:ascii="Times New Roman" w:hAnsi="Times New Roman" w:cs="Times New Roman"/>
       </w:rPr>
     </w:lvl>
   </w:abstractNum>
@@ -11065,7 +10696,7 @@
         <w:ind w:left="720" w:hanging="360"/>
       </w:pPr>
       <w:rPr>
-        <w:rFonts w:ascii="Times New Roman" w:eastAsia="Calibri" w:hAnsi="Times New Roman" w:cs="Times New Roman" w:hint="default"/>
+        <w:rFonts w:hint="default" w:ascii="Times New Roman" w:hAnsi="Times New Roman" w:eastAsia="Calibri" w:cs="Times New Roman"/>
       </w:rPr>
     </w:lvl>
     <w:lvl w:ilvl="1" w:tplc="04090003" w:tentative="1">
@@ -11077,7 +10708,7 @@
         <w:ind w:left="1440" w:hanging="360"/>
       </w:pPr>
       <w:rPr>
-        <w:rFonts w:ascii="Courier New" w:hAnsi="Courier New" w:cs="Courier New" w:hint="default"/>
+        <w:rFonts w:hint="default" w:ascii="Courier New" w:hAnsi="Courier New" w:cs="Courier New"/>
       </w:rPr>
     </w:lvl>
     <w:lvl w:ilvl="2" w:tplc="04090005" w:tentative="1">
@@ -11089,7 +10720,7 @@
         <w:ind w:left="2160" w:hanging="360"/>
       </w:pPr>
       <w:rPr>
-        <w:rFonts w:ascii="Wingdings" w:hAnsi="Wingdings" w:hint="default"/>
+        <w:rFonts w:hint="default" w:ascii="Wingdings" w:hAnsi="Wingdings"/>
       </w:rPr>
     </w:lvl>
     <w:lvl w:ilvl="3" w:tplc="04090001" w:tentative="1">
@@ -11101,7 +10732,7 @@
         <w:ind w:left="2880" w:hanging="360"/>
       </w:pPr>
       <w:rPr>
-        <w:rFonts w:ascii="Symbol" w:hAnsi="Symbol" w:hint="default"/>
+        <w:rFonts w:hint="default" w:ascii="Symbol" w:hAnsi="Symbol"/>
       </w:rPr>
     </w:lvl>
     <w:lvl w:ilvl="4" w:tplc="04090003" w:tentative="1">
@@ -11113,7 +10744,7 @@
         <w:ind w:left="3600" w:hanging="360"/>
       </w:pPr>
       <w:rPr>
-        <w:rFonts w:ascii="Courier New" w:hAnsi="Courier New" w:cs="Courier New" w:hint="default"/>
+        <w:rFonts w:hint="default" w:ascii="Courier New" w:hAnsi="Courier New" w:cs="Courier New"/>
       </w:rPr>
     </w:lvl>
     <w:lvl w:ilvl="5" w:tplc="04090005" w:tentative="1">
@@ -11125,7 +10756,7 @@
         <w:ind w:left="4320" w:hanging="360"/>
       </w:pPr>
       <w:rPr>
-        <w:rFonts w:ascii="Wingdings" w:hAnsi="Wingdings" w:hint="default"/>
+        <w:rFonts w:hint="default" w:ascii="Wingdings" w:hAnsi="Wingdings"/>
       </w:rPr>
     </w:lvl>
     <w:lvl w:ilvl="6" w:tplc="04090001" w:tentative="1">
@@ -11137,7 +10768,7 @@
         <w:ind w:left="5040" w:hanging="360"/>
       </w:pPr>
       <w:rPr>
-        <w:rFonts w:ascii="Symbol" w:hAnsi="Symbol" w:hint="default"/>
+        <w:rFonts w:hint="default" w:ascii="Symbol" w:hAnsi="Symbol"/>
       </w:rPr>
     </w:lvl>
     <w:lvl w:ilvl="7" w:tplc="04090003" w:tentative="1">
@@ -11149,7 +10780,7 @@
         <w:ind w:left="5760" w:hanging="360"/>
       </w:pPr>
       <w:rPr>
-        <w:rFonts w:ascii="Courier New" w:hAnsi="Courier New" w:cs="Courier New" w:hint="default"/>
+        <w:rFonts w:hint="default" w:ascii="Courier New" w:hAnsi="Courier New" w:cs="Courier New"/>
       </w:rPr>
     </w:lvl>
     <w:lvl w:ilvl="8" w:tplc="04090005" w:tentative="1">
@@ -11161,7 +10792,7 @@
         <w:ind w:left="6480" w:hanging="360"/>
       </w:pPr>
       <w:rPr>
-        <w:rFonts w:ascii="Wingdings" w:hAnsi="Wingdings" w:hint="default"/>
+        <w:rFonts w:hint="default" w:ascii="Wingdings" w:hAnsi="Wingdings"/>
       </w:rPr>
     </w:lvl>
   </w:abstractNum>
@@ -11179,7 +10810,7 @@
         <w:ind w:left="720" w:hanging="360"/>
       </w:pPr>
       <w:rPr>
-        <w:rFonts w:ascii="Wingdings" w:hAnsi="Wingdings" w:hint="default"/>
+        <w:rFonts w:hint="default" w:ascii="Wingdings" w:hAnsi="Wingdings"/>
       </w:rPr>
     </w:lvl>
     <w:lvl w:ilvl="1" w:tplc="042A0003" w:tentative="1">
@@ -11191,7 +10822,7 @@
         <w:ind w:left="1650" w:hanging="360"/>
       </w:pPr>
       <w:rPr>
-        <w:rFonts w:ascii="Courier New" w:hAnsi="Courier New" w:cs="Courier New" w:hint="default"/>
+        <w:rFonts w:hint="default" w:ascii="Courier New" w:hAnsi="Courier New" w:cs="Courier New"/>
       </w:rPr>
     </w:lvl>
     <w:lvl w:ilvl="2" w:tplc="042A0005" w:tentative="1">
@@ -11203,7 +10834,7 @@
         <w:ind w:left="2370" w:hanging="360"/>
       </w:pPr>
       <w:rPr>
-        <w:rFonts w:ascii="Wingdings" w:hAnsi="Wingdings" w:hint="default"/>
+        <w:rFonts w:hint="default" w:ascii="Wingdings" w:hAnsi="Wingdings"/>
       </w:rPr>
     </w:lvl>
     <w:lvl w:ilvl="3" w:tplc="042A0001" w:tentative="1">
@@ -11215,7 +10846,7 @@
         <w:ind w:left="3090" w:hanging="360"/>
       </w:pPr>
       <w:rPr>
-        <w:rFonts w:ascii="Symbol" w:hAnsi="Symbol" w:hint="default"/>
+        <w:rFonts w:hint="default" w:ascii="Symbol" w:hAnsi="Symbol"/>
       </w:rPr>
     </w:lvl>
     <w:lvl w:ilvl="4" w:tplc="042A0003" w:tentative="1">
@@ -11227,7 +10858,7 @@
         <w:ind w:left="3810" w:hanging="360"/>
       </w:pPr>
       <w:rPr>
-        <w:rFonts w:ascii="Courier New" w:hAnsi="Courier New" w:cs="Courier New" w:hint="default"/>
+        <w:rFonts w:hint="default" w:ascii="Courier New" w:hAnsi="Courier New" w:cs="Courier New"/>
       </w:rPr>
     </w:lvl>
     <w:lvl w:ilvl="5" w:tplc="042A0005" w:tentative="1">
@@ -11239,7 +10870,7 @@
         <w:ind w:left="4530" w:hanging="360"/>
       </w:pPr>
       <w:rPr>
-        <w:rFonts w:ascii="Wingdings" w:hAnsi="Wingdings" w:hint="default"/>
+        <w:rFonts w:hint="default" w:ascii="Wingdings" w:hAnsi="Wingdings"/>
       </w:rPr>
     </w:lvl>
     <w:lvl w:ilvl="6" w:tplc="042A0001" w:tentative="1">
@@ -11251,7 +10882,7 @@
         <w:ind w:left="5250" w:hanging="360"/>
       </w:pPr>
       <w:rPr>
-        <w:rFonts w:ascii="Symbol" w:hAnsi="Symbol" w:hint="default"/>
+        <w:rFonts w:hint="default" w:ascii="Symbol" w:hAnsi="Symbol"/>
       </w:rPr>
     </w:lvl>
     <w:lvl w:ilvl="7" w:tplc="042A0003" w:tentative="1">
@@ -11263,7 +10894,7 @@
         <w:ind w:left="5970" w:hanging="360"/>
       </w:pPr>
       <w:rPr>
-        <w:rFonts w:ascii="Courier New" w:hAnsi="Courier New" w:cs="Courier New" w:hint="default"/>
+        <w:rFonts w:hint="default" w:ascii="Courier New" w:hAnsi="Courier New" w:cs="Courier New"/>
       </w:rPr>
     </w:lvl>
     <w:lvl w:ilvl="8" w:tplc="042A0005" w:tentative="1">
@@ -11275,7 +10906,7 @@
         <w:ind w:left="6690" w:hanging="360"/>
       </w:pPr>
       <w:rPr>
-        <w:rFonts w:ascii="Wingdings" w:hAnsi="Wingdings" w:hint="default"/>
+        <w:rFonts w:hint="default" w:ascii="Wingdings" w:hAnsi="Wingdings"/>
       </w:rPr>
     </w:lvl>
   </w:abstractNum>
@@ -11291,7 +10922,7 @@
         <w:ind w:left="720" w:hanging="360"/>
       </w:pPr>
       <w:rPr>
-        <w:rFonts w:ascii="Times New Roman" w:eastAsia="Calibri" w:hAnsi="Times New Roman" w:cs="Times New Roman" w:hint="default"/>
+        <w:rFonts w:hint="default" w:ascii="Times New Roman" w:hAnsi="Times New Roman" w:eastAsia="Calibri" w:cs="Times New Roman"/>
       </w:rPr>
     </w:lvl>
     <w:lvl w:ilvl="1" w:tplc="04090003" w:tentative="1">
@@ -11303,7 +10934,7 @@
         <w:ind w:left="1440" w:hanging="360"/>
       </w:pPr>
       <w:rPr>
-        <w:rFonts w:ascii="Courier New" w:hAnsi="Courier New" w:cs="Courier New" w:hint="default"/>
+        <w:rFonts w:hint="default" w:ascii="Courier New" w:hAnsi="Courier New" w:cs="Courier New"/>
       </w:rPr>
     </w:lvl>
     <w:lvl w:ilvl="2" w:tplc="04090005" w:tentative="1">
@@ -11315,7 +10946,7 @@
         <w:ind w:left="2160" w:hanging="360"/>
       </w:pPr>
       <w:rPr>
-        <w:rFonts w:ascii="Wingdings" w:hAnsi="Wingdings" w:hint="default"/>
+        <w:rFonts w:hint="default" w:ascii="Wingdings" w:hAnsi="Wingdings"/>
       </w:rPr>
     </w:lvl>
     <w:lvl w:ilvl="3" w:tplc="04090001" w:tentative="1">
@@ -11327,7 +10958,7 @@
         <w:ind w:left="2880" w:hanging="360"/>
       </w:pPr>
       <w:rPr>
-        <w:rFonts w:ascii="Symbol" w:hAnsi="Symbol" w:hint="default"/>
+        <w:rFonts w:hint="default" w:ascii="Symbol" w:hAnsi="Symbol"/>
       </w:rPr>
     </w:lvl>
     <w:lvl w:ilvl="4" w:tplc="04090003" w:tentative="1">
@@ -11339,7 +10970,7 @@
         <w:ind w:left="3600" w:hanging="360"/>
       </w:pPr>
       <w:rPr>
-        <w:rFonts w:ascii="Courier New" w:hAnsi="Courier New" w:cs="Courier New" w:hint="default"/>
+        <w:rFonts w:hint="default" w:ascii="Courier New" w:hAnsi="Courier New" w:cs="Courier New"/>
       </w:rPr>
     </w:lvl>
     <w:lvl w:ilvl="5" w:tplc="04090005" w:tentative="1">
@@ -11351,7 +10982,7 @@
         <w:ind w:left="4320" w:hanging="360"/>
       </w:pPr>
       <w:rPr>
-        <w:rFonts w:ascii="Wingdings" w:hAnsi="Wingdings" w:hint="default"/>
+        <w:rFonts w:hint="default" w:ascii="Wingdings" w:hAnsi="Wingdings"/>
       </w:rPr>
     </w:lvl>
     <w:lvl w:ilvl="6" w:tplc="04090001" w:tentative="1">
@@ -11363,7 +10994,7 @@
         <w:ind w:left="5040" w:hanging="360"/>
       </w:pPr>
       <w:rPr>
-        <w:rFonts w:ascii="Symbol" w:hAnsi="Symbol" w:hint="default"/>
+        <w:rFonts w:hint="default" w:ascii="Symbol" w:hAnsi="Symbol"/>
       </w:rPr>
     </w:lvl>
     <w:lvl w:ilvl="7" w:tplc="04090003" w:tentative="1">
@@ -11375,7 +11006,7 @@
         <w:ind w:left="5760" w:hanging="360"/>
       </w:pPr>
       <w:rPr>
-        <w:rFonts w:ascii="Courier New" w:hAnsi="Courier New" w:cs="Courier New" w:hint="default"/>
+        <w:rFonts w:hint="default" w:ascii="Courier New" w:hAnsi="Courier New" w:cs="Courier New"/>
       </w:rPr>
     </w:lvl>
     <w:lvl w:ilvl="8" w:tplc="04090005" w:tentative="1">
@@ -11387,7 +11018,7 @@
         <w:ind w:left="6480" w:hanging="360"/>
       </w:pPr>
       <w:rPr>
-        <w:rFonts w:ascii="Wingdings" w:hAnsi="Wingdings" w:hint="default"/>
+        <w:rFonts w:hint="default" w:ascii="Wingdings" w:hAnsi="Wingdings"/>
       </w:rPr>
     </w:lvl>
   </w:abstractNum>
@@ -11404,7 +11035,7 @@
         <w:ind w:left="1440" w:hanging="360"/>
       </w:pPr>
       <w:rPr>
-        <w:rFonts w:ascii="Times New Roman" w:eastAsia="Times New Roman" w:hAnsi="Times New Roman" w:cs="Times New Roman" w:hint="default"/>
+        <w:rFonts w:hint="default" w:ascii="Times New Roman" w:hAnsi="Times New Roman" w:eastAsia="Times New Roman" w:cs="Times New Roman"/>
         <w:b w:val="0"/>
         <w:i/>
         <w:sz w:val="18"/>
@@ -11419,7 +11050,7 @@
         <w:ind w:left="2160" w:hanging="360"/>
       </w:pPr>
       <w:rPr>
-        <w:rFonts w:ascii="Courier New" w:hAnsi="Courier New" w:cs="Courier New" w:hint="default"/>
+        <w:rFonts w:hint="default" w:ascii="Courier New" w:hAnsi="Courier New" w:cs="Courier New"/>
       </w:rPr>
     </w:lvl>
     <w:lvl w:ilvl="2" w:tplc="04090005" w:tentative="1">
@@ -11431,7 +11062,7 @@
         <w:ind w:left="2880" w:hanging="360"/>
       </w:pPr>
       <w:rPr>
-        <w:rFonts w:ascii="Wingdings" w:hAnsi="Wingdings" w:hint="default"/>
+        <w:rFonts w:hint="default" w:ascii="Wingdings" w:hAnsi="Wingdings"/>
       </w:rPr>
     </w:lvl>
     <w:lvl w:ilvl="3" w:tplc="04090001" w:tentative="1">
@@ -11443,7 +11074,7 @@
         <w:ind w:left="3600" w:hanging="360"/>
       </w:pPr>
       <w:rPr>
-        <w:rFonts w:ascii="Symbol" w:hAnsi="Symbol" w:hint="default"/>
+        <w:rFonts w:hint="default" w:ascii="Symbol" w:hAnsi="Symbol"/>
       </w:rPr>
     </w:lvl>
     <w:lvl w:ilvl="4" w:tplc="04090003" w:tentative="1">
@@ -11455,7 +11086,7 @@
         <w:ind w:left="4320" w:hanging="360"/>
       </w:pPr>
       <w:rPr>
-        <w:rFonts w:ascii="Courier New" w:hAnsi="Courier New" w:cs="Courier New" w:hint="default"/>
+        <w:rFonts w:hint="default" w:ascii="Courier New" w:hAnsi="Courier New" w:cs="Courier New"/>
       </w:rPr>
     </w:lvl>
     <w:lvl w:ilvl="5" w:tplc="04090005" w:tentative="1">
@@ -11467,7 +11098,7 @@
         <w:ind w:left="5040" w:hanging="360"/>
       </w:pPr>
       <w:rPr>
-        <w:rFonts w:ascii="Wingdings" w:hAnsi="Wingdings" w:hint="default"/>
+        <w:rFonts w:hint="default" w:ascii="Wingdings" w:hAnsi="Wingdings"/>
       </w:rPr>
     </w:lvl>
     <w:lvl w:ilvl="6" w:tplc="04090001" w:tentative="1">
@@ -11479,7 +11110,7 @@
         <w:ind w:left="5760" w:hanging="360"/>
       </w:pPr>
       <w:rPr>
-        <w:rFonts w:ascii="Symbol" w:hAnsi="Symbol" w:hint="default"/>
+        <w:rFonts w:hint="default" w:ascii="Symbol" w:hAnsi="Symbol"/>
       </w:rPr>
     </w:lvl>
     <w:lvl w:ilvl="7" w:tplc="04090003" w:tentative="1">
@@ -11491,7 +11122,7 @@
         <w:ind w:left="6480" w:hanging="360"/>
       </w:pPr>
       <w:rPr>
-        <w:rFonts w:ascii="Courier New" w:hAnsi="Courier New" w:cs="Courier New" w:hint="default"/>
+        <w:rFonts w:hint="default" w:ascii="Courier New" w:hAnsi="Courier New" w:cs="Courier New"/>
       </w:rPr>
     </w:lvl>
     <w:lvl w:ilvl="8" w:tplc="04090005" w:tentative="1">
@@ -11503,7 +11134,7 @@
         <w:ind w:left="7200" w:hanging="360"/>
       </w:pPr>
       <w:rPr>
-        <w:rFonts w:ascii="Wingdings" w:hAnsi="Wingdings" w:hint="default"/>
+        <w:rFonts w:hint="default" w:ascii="Wingdings" w:hAnsi="Wingdings"/>
       </w:rPr>
     </w:lvl>
   </w:abstractNum>
@@ -11519,7 +11150,7 @@
         <w:ind w:left="927" w:hanging="360"/>
       </w:pPr>
       <w:rPr>
-        <w:rFonts w:ascii="Times New Roman" w:eastAsia="Times New Roman" w:hAnsi="Times New Roman" w:cs="Times New Roman" w:hint="default"/>
+        <w:rFonts w:hint="default" w:ascii="Times New Roman" w:hAnsi="Times New Roman" w:eastAsia="Times New Roman" w:cs="Times New Roman"/>
       </w:rPr>
     </w:lvl>
     <w:lvl w:ilvl="1" w:tplc="04090003">
@@ -11531,7 +11162,7 @@
         <w:ind w:left="1647" w:hanging="360"/>
       </w:pPr>
       <w:rPr>
-        <w:rFonts w:ascii="Courier New" w:hAnsi="Courier New" w:cs="Courier New" w:hint="default"/>
+        <w:rFonts w:hint="default" w:ascii="Courier New" w:hAnsi="Courier New" w:cs="Courier New"/>
       </w:rPr>
     </w:lvl>
     <w:lvl w:ilvl="2" w:tplc="04090005">
@@ -11543,7 +11174,7 @@
         <w:ind w:left="2367" w:hanging="360"/>
       </w:pPr>
       <w:rPr>
-        <w:rFonts w:ascii="Wingdings" w:hAnsi="Wingdings" w:hint="default"/>
+        <w:rFonts w:hint="default" w:ascii="Wingdings" w:hAnsi="Wingdings"/>
       </w:rPr>
     </w:lvl>
     <w:lvl w:ilvl="3" w:tplc="04090001">
@@ -11555,7 +11186,7 @@
         <w:ind w:left="3087" w:hanging="360"/>
       </w:pPr>
       <w:rPr>
-        <w:rFonts w:ascii="Symbol" w:hAnsi="Symbol" w:hint="default"/>
+        <w:rFonts w:hint="default" w:ascii="Symbol" w:hAnsi="Symbol"/>
       </w:rPr>
     </w:lvl>
     <w:lvl w:ilvl="4" w:tplc="04090003" w:tentative="1">
@@ -11567,7 +11198,7 @@
         <w:ind w:left="3807" w:hanging="360"/>
       </w:pPr>
       <w:rPr>
-        <w:rFonts w:ascii="Courier New" w:hAnsi="Courier New" w:cs="Courier New" w:hint="default"/>
+        <w:rFonts w:hint="default" w:ascii="Courier New" w:hAnsi="Courier New" w:cs="Courier New"/>
       </w:rPr>
     </w:lvl>
     <w:lvl w:ilvl="5" w:tplc="04090005" w:tentative="1">
@@ -11579,7 +11210,7 @@
         <w:ind w:left="4527" w:hanging="360"/>
       </w:pPr>
       <w:rPr>
-        <w:rFonts w:ascii="Wingdings" w:hAnsi="Wingdings" w:hint="default"/>
+        <w:rFonts w:hint="default" w:ascii="Wingdings" w:hAnsi="Wingdings"/>
       </w:rPr>
     </w:lvl>
     <w:lvl w:ilvl="6" w:tplc="04090001" w:tentative="1">
@@ -11591,7 +11222,7 @@
         <w:ind w:left="5247" w:hanging="360"/>
       </w:pPr>
       <w:rPr>
-        <w:rFonts w:ascii="Symbol" w:hAnsi="Symbol" w:hint="default"/>
+        <w:rFonts w:hint="default" w:ascii="Symbol" w:hAnsi="Symbol"/>
       </w:rPr>
     </w:lvl>
     <w:lvl w:ilvl="7" w:tplc="04090003" w:tentative="1">
@@ -11603,7 +11234,7 @@
         <w:ind w:left="5967" w:hanging="360"/>
       </w:pPr>
       <w:rPr>
-        <w:rFonts w:ascii="Courier New" w:hAnsi="Courier New" w:cs="Courier New" w:hint="default"/>
+        <w:rFonts w:hint="default" w:ascii="Courier New" w:hAnsi="Courier New" w:cs="Courier New"/>
       </w:rPr>
     </w:lvl>
     <w:lvl w:ilvl="8" w:tplc="04090005" w:tentative="1">
@@ -11615,7 +11246,7 @@
         <w:ind w:left="6687" w:hanging="360"/>
       </w:pPr>
       <w:rPr>
-        <w:rFonts w:ascii="Wingdings" w:hAnsi="Wingdings" w:hint="default"/>
+        <w:rFonts w:hint="default" w:ascii="Wingdings" w:hAnsi="Wingdings"/>
       </w:rPr>
     </w:lvl>
   </w:abstractNum>
@@ -11732,7 +11363,7 @@
         <w:ind w:left="2007" w:hanging="360"/>
       </w:pPr>
       <w:rPr>
-        <w:rFonts w:ascii="Courier New" w:hAnsi="Courier New" w:cs="Courier New" w:hint="default"/>
+        <w:rFonts w:hint="default" w:ascii="Courier New" w:hAnsi="Courier New" w:cs="Courier New"/>
       </w:rPr>
     </w:lvl>
     <w:lvl w:ilvl="2" w:tplc="04090005" w:tentative="1">
@@ -11744,7 +11375,7 @@
         <w:ind w:left="2727" w:hanging="360"/>
       </w:pPr>
       <w:rPr>
-        <w:rFonts w:ascii="Wingdings" w:hAnsi="Wingdings" w:hint="default"/>
+        <w:rFonts w:hint="default" w:ascii="Wingdings" w:hAnsi="Wingdings"/>
       </w:rPr>
     </w:lvl>
     <w:lvl w:ilvl="3" w:tplc="04090001" w:tentative="1">
@@ -11756,7 +11387,7 @@
         <w:ind w:left="3447" w:hanging="360"/>
       </w:pPr>
       <w:rPr>
-        <w:rFonts w:ascii="Symbol" w:hAnsi="Symbol" w:hint="default"/>
+        <w:rFonts w:hint="default" w:ascii="Symbol" w:hAnsi="Symbol"/>
       </w:rPr>
     </w:lvl>
     <w:lvl w:ilvl="4" w:tplc="04090003" w:tentative="1">
@@ -11768,7 +11399,7 @@
         <w:ind w:left="4167" w:hanging="360"/>
       </w:pPr>
       <w:rPr>
-        <w:rFonts w:ascii="Courier New" w:hAnsi="Courier New" w:cs="Courier New" w:hint="default"/>
+        <w:rFonts w:hint="default" w:ascii="Courier New" w:hAnsi="Courier New" w:cs="Courier New"/>
       </w:rPr>
     </w:lvl>
     <w:lvl w:ilvl="5" w:tplc="04090005" w:tentative="1">
@@ -11780,7 +11411,7 @@
         <w:ind w:left="4887" w:hanging="360"/>
       </w:pPr>
       <w:rPr>
-        <w:rFonts w:ascii="Wingdings" w:hAnsi="Wingdings" w:hint="default"/>
+        <w:rFonts w:hint="default" w:ascii="Wingdings" w:hAnsi="Wingdings"/>
       </w:rPr>
     </w:lvl>
     <w:lvl w:ilvl="6" w:tplc="04090001" w:tentative="1">
@@ -11792,7 +11423,7 @@
         <w:ind w:left="5607" w:hanging="360"/>
       </w:pPr>
       <w:rPr>
-        <w:rFonts w:ascii="Symbol" w:hAnsi="Symbol" w:hint="default"/>
+        <w:rFonts w:hint="default" w:ascii="Symbol" w:hAnsi="Symbol"/>
       </w:rPr>
     </w:lvl>
     <w:lvl w:ilvl="7" w:tplc="04090003" w:tentative="1">
@@ -11804,7 +11435,7 @@
         <w:ind w:left="6327" w:hanging="360"/>
       </w:pPr>
       <w:rPr>
-        <w:rFonts w:ascii="Courier New" w:hAnsi="Courier New" w:cs="Courier New" w:hint="default"/>
+        <w:rFonts w:hint="default" w:ascii="Courier New" w:hAnsi="Courier New" w:cs="Courier New"/>
       </w:rPr>
     </w:lvl>
     <w:lvl w:ilvl="8" w:tplc="04090005" w:tentative="1">
@@ -11816,7 +11447,7 @@
         <w:ind w:left="7047" w:hanging="360"/>
       </w:pPr>
       <w:rPr>
-        <w:rFonts w:ascii="Wingdings" w:hAnsi="Wingdings" w:hint="default"/>
+        <w:rFonts w:hint="default" w:ascii="Wingdings" w:hAnsi="Wingdings"/>
       </w:rPr>
     </w:lvl>
   </w:abstractNum>
@@ -11833,7 +11464,7 @@
         <w:ind w:left="720" w:hanging="360"/>
       </w:pPr>
       <w:rPr>
-        <w:rFonts w:ascii="Symbol" w:hAnsi="Symbol" w:hint="default"/>
+        <w:rFonts w:hint="default" w:ascii="Symbol" w:hAnsi="Symbol"/>
       </w:rPr>
     </w:lvl>
     <w:lvl w:ilvl="1" w:tplc="042A0003" w:tentative="1">
@@ -11845,7 +11476,7 @@
         <w:ind w:left="1440" w:hanging="360"/>
       </w:pPr>
       <w:rPr>
-        <w:rFonts w:ascii="Courier New" w:hAnsi="Courier New" w:cs="Courier New" w:hint="default"/>
+        <w:rFonts w:hint="default" w:ascii="Courier New" w:hAnsi="Courier New" w:cs="Courier New"/>
       </w:rPr>
     </w:lvl>
     <w:lvl w:ilvl="2" w:tplc="042A0005" w:tentative="1">
@@ -11857,7 +11488,7 @@
         <w:ind w:left="2160" w:hanging="360"/>
       </w:pPr>
       <w:rPr>
-        <w:rFonts w:ascii="Wingdings" w:hAnsi="Wingdings" w:hint="default"/>
+        <w:rFonts w:hint="default" w:ascii="Wingdings" w:hAnsi="Wingdings"/>
       </w:rPr>
     </w:lvl>
     <w:lvl w:ilvl="3" w:tplc="042A0001" w:tentative="1">
@@ -11869,7 +11500,7 @@
         <w:ind w:left="2880" w:hanging="360"/>
       </w:pPr>
       <w:rPr>
-        <w:rFonts w:ascii="Symbol" w:hAnsi="Symbol" w:hint="default"/>
+        <w:rFonts w:hint="default" w:ascii="Symbol" w:hAnsi="Symbol"/>
       </w:rPr>
     </w:lvl>
     <w:lvl w:ilvl="4" w:tplc="042A0003" w:tentative="1">
@@ -11881,7 +11512,7 @@
         <w:ind w:left="3600" w:hanging="360"/>
       </w:pPr>
       <w:rPr>
-        <w:rFonts w:ascii="Courier New" w:hAnsi="Courier New" w:cs="Courier New" w:hint="default"/>
+        <w:rFonts w:hint="default" w:ascii="Courier New" w:hAnsi="Courier New" w:cs="Courier New"/>
       </w:rPr>
     </w:lvl>
     <w:lvl w:ilvl="5" w:tplc="042A0005" w:tentative="1">
@@ -11893,7 +11524,7 @@
         <w:ind w:left="4320" w:hanging="360"/>
       </w:pPr>
       <w:rPr>
-        <w:rFonts w:ascii="Wingdings" w:hAnsi="Wingdings" w:hint="default"/>
+        <w:rFonts w:hint="default" w:ascii="Wingdings" w:hAnsi="Wingdings"/>
       </w:rPr>
     </w:lvl>
     <w:lvl w:ilvl="6" w:tplc="042A0001" w:tentative="1">
@@ -11905,7 +11536,7 @@
         <w:ind w:left="5040" w:hanging="360"/>
       </w:pPr>
       <w:rPr>
-        <w:rFonts w:ascii="Symbol" w:hAnsi="Symbol" w:hint="default"/>
+        <w:rFonts w:hint="default" w:ascii="Symbol" w:hAnsi="Symbol"/>
       </w:rPr>
     </w:lvl>
     <w:lvl w:ilvl="7" w:tplc="042A0003" w:tentative="1">
@@ -11917,7 +11548,7 @@
         <w:ind w:left="5760" w:hanging="360"/>
       </w:pPr>
       <w:rPr>
-        <w:rFonts w:ascii="Courier New" w:hAnsi="Courier New" w:cs="Courier New" w:hint="default"/>
+        <w:rFonts w:hint="default" w:ascii="Courier New" w:hAnsi="Courier New" w:cs="Courier New"/>
       </w:rPr>
     </w:lvl>
     <w:lvl w:ilvl="8" w:tplc="042A0005" w:tentative="1">
@@ -11929,7 +11560,7 @@
         <w:ind w:left="6480" w:hanging="360"/>
       </w:pPr>
       <w:rPr>
-        <w:rFonts w:ascii="Wingdings" w:hAnsi="Wingdings" w:hint="default"/>
+        <w:rFonts w:hint="default" w:ascii="Wingdings" w:hAnsi="Wingdings"/>
       </w:rPr>
     </w:lvl>
   </w:abstractNum>
@@ -11960,7 +11591,7 @@
         <w:ind w:left="1440" w:hanging="360"/>
       </w:pPr>
       <w:rPr>
-        <w:rFonts w:ascii="Courier New" w:hAnsi="Courier New" w:hint="default"/>
+        <w:rFonts w:hint="default" w:ascii="Courier New" w:hAnsi="Courier New"/>
       </w:rPr>
     </w:lvl>
     <w:lvl w:ilvl="2" w:tplc="04090005">
@@ -11975,7 +11606,7 @@
         <w:ind w:left="2160" w:hanging="360"/>
       </w:pPr>
       <w:rPr>
-        <w:rFonts w:ascii="Wingdings" w:hAnsi="Wingdings" w:hint="default"/>
+        <w:rFonts w:hint="default" w:ascii="Wingdings" w:hAnsi="Wingdings"/>
       </w:rPr>
     </w:lvl>
     <w:lvl w:ilvl="3" w:tplc="04090001">
@@ -11990,7 +11621,7 @@
         <w:ind w:left="2880" w:hanging="360"/>
       </w:pPr>
       <w:rPr>
-        <w:rFonts w:ascii="Symbol" w:hAnsi="Symbol" w:hint="default"/>
+        <w:rFonts w:hint="default" w:ascii="Symbol" w:hAnsi="Symbol"/>
       </w:rPr>
     </w:lvl>
     <w:lvl w:ilvl="4" w:tplc="04090003">
@@ -12005,7 +11636,7 @@
         <w:ind w:left="3600" w:hanging="360"/>
       </w:pPr>
       <w:rPr>
-        <w:rFonts w:ascii="Courier New" w:hAnsi="Courier New" w:hint="default"/>
+        <w:rFonts w:hint="default" w:ascii="Courier New" w:hAnsi="Courier New"/>
       </w:rPr>
     </w:lvl>
     <w:lvl w:ilvl="5" w:tplc="04090005">
@@ -12020,7 +11651,7 @@
         <w:ind w:left="4320" w:hanging="360"/>
       </w:pPr>
       <w:rPr>
-        <w:rFonts w:ascii="Wingdings" w:hAnsi="Wingdings" w:hint="default"/>
+        <w:rFonts w:hint="default" w:ascii="Wingdings" w:hAnsi="Wingdings"/>
       </w:rPr>
     </w:lvl>
     <w:lvl w:ilvl="6" w:tplc="04090001">
@@ -12035,7 +11666,7 @@
         <w:ind w:left="5040" w:hanging="360"/>
       </w:pPr>
       <w:rPr>
-        <w:rFonts w:ascii="Symbol" w:hAnsi="Symbol" w:hint="default"/>
+        <w:rFonts w:hint="default" w:ascii="Symbol" w:hAnsi="Symbol"/>
       </w:rPr>
     </w:lvl>
     <w:lvl w:ilvl="7" w:tplc="04090003">
@@ -12050,7 +11681,7 @@
         <w:ind w:left="5760" w:hanging="360"/>
       </w:pPr>
       <w:rPr>
-        <w:rFonts w:ascii="Courier New" w:hAnsi="Courier New" w:hint="default"/>
+        <w:rFonts w:hint="default" w:ascii="Courier New" w:hAnsi="Courier New"/>
       </w:rPr>
     </w:lvl>
     <w:lvl w:ilvl="8" w:tplc="04090005">
@@ -12065,7 +11696,7 @@
         <w:ind w:left="6480" w:hanging="360"/>
       </w:pPr>
       <w:rPr>
-        <w:rFonts w:ascii="Wingdings" w:hAnsi="Wingdings" w:hint="default"/>
+        <w:rFonts w:hint="default" w:ascii="Wingdings" w:hAnsi="Wingdings"/>
       </w:rPr>
     </w:lvl>
   </w:abstractNum>
@@ -12171,7 +11802,7 @@
         <w:ind w:left="1440" w:hanging="360"/>
       </w:pPr>
       <w:rPr>
-        <w:rFonts w:ascii="Symbol" w:hAnsi="Symbol" w:hint="default"/>
+        <w:rFonts w:hint="default" w:ascii="Symbol" w:hAnsi="Symbol"/>
       </w:rPr>
     </w:lvl>
     <w:lvl w:ilvl="1" w:tplc="04090003" w:tentative="1">
@@ -12183,7 +11814,7 @@
         <w:ind w:left="2160" w:hanging="360"/>
       </w:pPr>
       <w:rPr>
-        <w:rFonts w:ascii="Courier New" w:hAnsi="Courier New" w:cs="Courier New" w:hint="default"/>
+        <w:rFonts w:hint="default" w:ascii="Courier New" w:hAnsi="Courier New" w:cs="Courier New"/>
       </w:rPr>
     </w:lvl>
     <w:lvl w:ilvl="2" w:tplc="04090005" w:tentative="1">
@@ -12195,7 +11826,7 @@
         <w:ind w:left="2880" w:hanging="360"/>
       </w:pPr>
       <w:rPr>
-        <w:rFonts w:ascii="Wingdings" w:hAnsi="Wingdings" w:hint="default"/>
+        <w:rFonts w:hint="default" w:ascii="Wingdings" w:hAnsi="Wingdings"/>
       </w:rPr>
     </w:lvl>
     <w:lvl w:ilvl="3" w:tplc="04090001" w:tentative="1">
@@ -12207,7 +11838,7 @@
         <w:ind w:left="3600" w:hanging="360"/>
       </w:pPr>
       <w:rPr>
-        <w:rFonts w:ascii="Symbol" w:hAnsi="Symbol" w:hint="default"/>
+        <w:rFonts w:hint="default" w:ascii="Symbol" w:hAnsi="Symbol"/>
       </w:rPr>
     </w:lvl>
     <w:lvl w:ilvl="4" w:tplc="04090003" w:tentative="1">
@@ -12219,7 +11850,7 @@
         <w:ind w:left="4320" w:hanging="360"/>
       </w:pPr>
       <w:rPr>
-        <w:rFonts w:ascii="Courier New" w:hAnsi="Courier New" w:cs="Courier New" w:hint="default"/>
+        <w:rFonts w:hint="default" w:ascii="Courier New" w:hAnsi="Courier New" w:cs="Courier New"/>
       </w:rPr>
     </w:lvl>
     <w:lvl w:ilvl="5" w:tplc="04090005" w:tentative="1">
@@ -12231,7 +11862,7 @@
         <w:ind w:left="5040" w:hanging="360"/>
       </w:pPr>
       <w:rPr>
-        <w:rFonts w:ascii="Wingdings" w:hAnsi="Wingdings" w:hint="default"/>
+        <w:rFonts w:hint="default" w:ascii="Wingdings" w:hAnsi="Wingdings"/>
       </w:rPr>
     </w:lvl>
     <w:lvl w:ilvl="6" w:tplc="04090001" w:tentative="1">
@@ -12243,7 +11874,7 @@
         <w:ind w:left="5760" w:hanging="360"/>
       </w:pPr>
       <w:rPr>
-        <w:rFonts w:ascii="Symbol" w:hAnsi="Symbol" w:hint="default"/>
+        <w:rFonts w:hint="default" w:ascii="Symbol" w:hAnsi="Symbol"/>
       </w:rPr>
     </w:lvl>
     <w:lvl w:ilvl="7" w:tplc="04090003" w:tentative="1">
@@ -12255,7 +11886,7 @@
         <w:ind w:left="6480" w:hanging="360"/>
       </w:pPr>
       <w:rPr>
-        <w:rFonts w:ascii="Courier New" w:hAnsi="Courier New" w:cs="Courier New" w:hint="default"/>
+        <w:rFonts w:hint="default" w:ascii="Courier New" w:hAnsi="Courier New" w:cs="Courier New"/>
       </w:rPr>
     </w:lvl>
     <w:lvl w:ilvl="8" w:tplc="04090005" w:tentative="1">
@@ -12267,7 +11898,7 @@
         <w:ind w:left="7200" w:hanging="360"/>
       </w:pPr>
       <w:rPr>
-        <w:rFonts w:ascii="Wingdings" w:hAnsi="Wingdings" w:hint="default"/>
+        <w:rFonts w:hint="default" w:ascii="Wingdings" w:hAnsi="Wingdings"/>
       </w:rPr>
     </w:lvl>
   </w:abstractNum>
@@ -12283,7 +11914,7 @@
         <w:ind w:left="720" w:hanging="360"/>
       </w:pPr>
       <w:rPr>
-        <w:rFonts w:ascii="Times New Roman" w:eastAsia="Calibri" w:hAnsi="Times New Roman" w:cs="Times New Roman" w:hint="default"/>
+        <w:rFonts w:hint="default" w:ascii="Times New Roman" w:hAnsi="Times New Roman" w:eastAsia="Calibri" w:cs="Times New Roman"/>
       </w:rPr>
     </w:lvl>
     <w:lvl w:ilvl="1" w:tplc="04090003" w:tentative="1">
@@ -12295,7 +11926,7 @@
         <w:ind w:left="1440" w:hanging="360"/>
       </w:pPr>
       <w:rPr>
-        <w:rFonts w:ascii="Courier New" w:hAnsi="Courier New" w:cs="Courier New" w:hint="default"/>
+        <w:rFonts w:hint="default" w:ascii="Courier New" w:hAnsi="Courier New" w:cs="Courier New"/>
       </w:rPr>
     </w:lvl>
     <w:lvl w:ilvl="2" w:tplc="04090005" w:tentative="1">
@@ -12307,7 +11938,7 @@
         <w:ind w:left="2160" w:hanging="360"/>
       </w:pPr>
       <w:rPr>
-        <w:rFonts w:ascii="Wingdings" w:hAnsi="Wingdings" w:hint="default"/>
+        <w:rFonts w:hint="default" w:ascii="Wingdings" w:hAnsi="Wingdings"/>
       </w:rPr>
     </w:lvl>
     <w:lvl w:ilvl="3" w:tplc="04090001" w:tentative="1">
@@ -12319,7 +11950,7 @@
         <w:ind w:left="2880" w:hanging="360"/>
       </w:pPr>
       <w:rPr>
-        <w:rFonts w:ascii="Symbol" w:hAnsi="Symbol" w:hint="default"/>
+        <w:rFonts w:hint="default" w:ascii="Symbol" w:hAnsi="Symbol"/>
       </w:rPr>
     </w:lvl>
     <w:lvl w:ilvl="4" w:tplc="04090003" w:tentative="1">
@@ -12331,7 +11962,7 @@
         <w:ind w:left="3600" w:hanging="360"/>
       </w:pPr>
       <w:rPr>
-        <w:rFonts w:ascii="Courier New" w:hAnsi="Courier New" w:cs="Courier New" w:hint="default"/>
+        <w:rFonts w:hint="default" w:ascii="Courier New" w:hAnsi="Courier New" w:cs="Courier New"/>
       </w:rPr>
     </w:lvl>
     <w:lvl w:ilvl="5" w:tplc="04090005" w:tentative="1">
@@ -12343,7 +11974,7 @@
         <w:ind w:left="4320" w:hanging="360"/>
       </w:pPr>
       <w:rPr>
-        <w:rFonts w:ascii="Wingdings" w:hAnsi="Wingdings" w:hint="default"/>
+        <w:rFonts w:hint="default" w:ascii="Wingdings" w:hAnsi="Wingdings"/>
       </w:rPr>
     </w:lvl>
     <w:lvl w:ilvl="6" w:tplc="04090001" w:tentative="1">
@@ -12355,7 +11986,7 @@
         <w:ind w:left="5040" w:hanging="360"/>
       </w:pPr>
       <w:rPr>
-        <w:rFonts w:ascii="Symbol" w:hAnsi="Symbol" w:hint="default"/>
+        <w:rFonts w:hint="default" w:ascii="Symbol" w:hAnsi="Symbol"/>
       </w:rPr>
     </w:lvl>
     <w:lvl w:ilvl="7" w:tplc="04090003" w:tentative="1">
@@ -12367,7 +11998,7 @@
         <w:ind w:left="5760" w:hanging="360"/>
       </w:pPr>
       <w:rPr>
-        <w:rFonts w:ascii="Courier New" w:hAnsi="Courier New" w:cs="Courier New" w:hint="default"/>
+        <w:rFonts w:hint="default" w:ascii="Courier New" w:hAnsi="Courier New" w:cs="Courier New"/>
       </w:rPr>
     </w:lvl>
     <w:lvl w:ilvl="8" w:tplc="04090005" w:tentative="1">
@@ -12379,7 +12010,7 @@
         <w:ind w:left="6480" w:hanging="360"/>
       </w:pPr>
       <w:rPr>
-        <w:rFonts w:ascii="Wingdings" w:hAnsi="Wingdings" w:hint="default"/>
+        <w:rFonts w:hint="default" w:ascii="Wingdings" w:hAnsi="Wingdings"/>
       </w:rPr>
     </w:lvl>
   </w:abstractNum>
@@ -12485,7 +12116,7 @@
         <w:ind w:left="1080" w:hanging="360"/>
       </w:pPr>
       <w:rPr>
-        <w:rFonts w:cs="Cambria" w:hint="default"/>
+        <w:rFonts w:hint="default" w:cs="Cambria"/>
       </w:rPr>
     </w:lvl>
     <w:lvl w:ilvl="1" w:tplc="08090019" w:tentative="1">
@@ -12573,7 +12204,7 @@
         <w:ind w:left="720" w:hanging="360"/>
       </w:pPr>
       <w:rPr>
-        <w:rFonts w:ascii="Times New Roman" w:eastAsia="Times New Roman" w:hAnsi="Times New Roman" w:cs="Times New Roman" w:hint="default"/>
+        <w:rFonts w:hint="default" w:ascii="Times New Roman" w:hAnsi="Times New Roman" w:eastAsia="Times New Roman" w:cs="Times New Roman"/>
       </w:rPr>
     </w:lvl>
     <w:lvl w:ilvl="1" w:tplc="042A0003" w:tentative="1">
@@ -12585,7 +12216,7 @@
         <w:ind w:left="1440" w:hanging="360"/>
       </w:pPr>
       <w:rPr>
-        <w:rFonts w:ascii="Courier New" w:hAnsi="Courier New" w:cs="Courier New" w:hint="default"/>
+        <w:rFonts w:hint="default" w:ascii="Courier New" w:hAnsi="Courier New" w:cs="Courier New"/>
       </w:rPr>
     </w:lvl>
     <w:lvl w:ilvl="2" w:tplc="042A0005" w:tentative="1">
@@ -12597,7 +12228,7 @@
         <w:ind w:left="2160" w:hanging="360"/>
       </w:pPr>
       <w:rPr>
-        <w:rFonts w:ascii="Wingdings" w:hAnsi="Wingdings" w:hint="default"/>
+        <w:rFonts w:hint="default" w:ascii="Wingdings" w:hAnsi="Wingdings"/>
       </w:rPr>
     </w:lvl>
     <w:lvl w:ilvl="3" w:tplc="042A0001" w:tentative="1">
@@ -12609,7 +12240,7 @@
         <w:ind w:left="2880" w:hanging="360"/>
       </w:pPr>
       <w:rPr>
-        <w:rFonts w:ascii="Symbol" w:hAnsi="Symbol" w:hint="default"/>
+        <w:rFonts w:hint="default" w:ascii="Symbol" w:hAnsi="Symbol"/>
       </w:rPr>
     </w:lvl>
     <w:lvl w:ilvl="4" w:tplc="042A0003">
@@ -12621,7 +12252,7 @@
         <w:ind w:left="3600" w:hanging="360"/>
       </w:pPr>
       <w:rPr>
-        <w:rFonts w:ascii="Courier New" w:hAnsi="Courier New" w:cs="Courier New" w:hint="default"/>
+        <w:rFonts w:hint="default" w:ascii="Courier New" w:hAnsi="Courier New" w:cs="Courier New"/>
       </w:rPr>
     </w:lvl>
     <w:lvl w:ilvl="5" w:tplc="042A0005" w:tentative="1">
@@ -12633,7 +12264,7 @@
         <w:ind w:left="4320" w:hanging="360"/>
       </w:pPr>
       <w:rPr>
-        <w:rFonts w:ascii="Wingdings" w:hAnsi="Wingdings" w:hint="default"/>
+        <w:rFonts w:hint="default" w:ascii="Wingdings" w:hAnsi="Wingdings"/>
       </w:rPr>
     </w:lvl>
     <w:lvl w:ilvl="6" w:tplc="042A0001" w:tentative="1">
@@ -12645,7 +12276,7 @@
         <w:ind w:left="5040" w:hanging="360"/>
       </w:pPr>
       <w:rPr>
-        <w:rFonts w:ascii="Symbol" w:hAnsi="Symbol" w:hint="default"/>
+        <w:rFonts w:hint="default" w:ascii="Symbol" w:hAnsi="Symbol"/>
       </w:rPr>
     </w:lvl>
     <w:lvl w:ilvl="7" w:tplc="042A0003" w:tentative="1">
@@ -12657,7 +12288,7 @@
         <w:ind w:left="5760" w:hanging="360"/>
       </w:pPr>
       <w:rPr>
-        <w:rFonts w:ascii="Courier New" w:hAnsi="Courier New" w:cs="Courier New" w:hint="default"/>
+        <w:rFonts w:hint="default" w:ascii="Courier New" w:hAnsi="Courier New" w:cs="Courier New"/>
       </w:rPr>
     </w:lvl>
     <w:lvl w:ilvl="8" w:tplc="042A0005" w:tentative="1">
@@ -12669,7 +12300,7 @@
         <w:ind w:left="6480" w:hanging="360"/>
       </w:pPr>
       <w:rPr>
-        <w:rFonts w:ascii="Wingdings" w:hAnsi="Wingdings" w:hint="default"/>
+        <w:rFonts w:hint="default" w:ascii="Wingdings" w:hAnsi="Wingdings"/>
       </w:rPr>
     </w:lvl>
   </w:abstractNum>
@@ -12772,7 +12403,7 @@
       <w:lvlText w:val=""/>
       <w:lvlJc w:val="left"/>
       <w:rPr>
-        <w:rFonts w:ascii="Symbol" w:hAnsi="Symbol" w:hint="default"/>
+        <w:rFonts w:hint="default" w:ascii="Symbol" w:hAnsi="Symbol"/>
       </w:rPr>
     </w:lvl>
     <w:lvl w:ilvl="1" w:tplc="04090003" w:tentative="1">
@@ -12784,7 +12415,7 @@
         <w:ind w:left="1440" w:hanging="360"/>
       </w:pPr>
       <w:rPr>
-        <w:rFonts w:ascii="Courier New" w:hAnsi="Courier New" w:cs="Courier New" w:hint="default"/>
+        <w:rFonts w:hint="default" w:ascii="Courier New" w:hAnsi="Courier New" w:cs="Courier New"/>
       </w:rPr>
     </w:lvl>
     <w:lvl w:ilvl="2" w:tplc="04090005" w:tentative="1">
@@ -12796,7 +12427,7 @@
         <w:ind w:left="2160" w:hanging="360"/>
       </w:pPr>
       <w:rPr>
-        <w:rFonts w:ascii="Wingdings" w:hAnsi="Wingdings" w:hint="default"/>
+        <w:rFonts w:hint="default" w:ascii="Wingdings" w:hAnsi="Wingdings"/>
       </w:rPr>
     </w:lvl>
     <w:lvl w:ilvl="3" w:tplc="04090001" w:tentative="1">
@@ -12808,7 +12439,7 @@
         <w:ind w:left="2880" w:hanging="360"/>
       </w:pPr>
       <w:rPr>
-        <w:rFonts w:ascii="Symbol" w:hAnsi="Symbol" w:hint="default"/>
+        <w:rFonts w:hint="default" w:ascii="Symbol" w:hAnsi="Symbol"/>
       </w:rPr>
     </w:lvl>
     <w:lvl w:ilvl="4" w:tplc="04090003" w:tentative="1">
@@ -12820,7 +12451,7 @@
         <w:ind w:left="3600" w:hanging="360"/>
       </w:pPr>
       <w:rPr>
-        <w:rFonts w:ascii="Courier New" w:hAnsi="Courier New" w:cs="Courier New" w:hint="default"/>
+        <w:rFonts w:hint="default" w:ascii="Courier New" w:hAnsi="Courier New" w:cs="Courier New"/>
       </w:rPr>
     </w:lvl>
     <w:lvl w:ilvl="5" w:tplc="04090005" w:tentative="1">
@@ -12832,7 +12463,7 @@
         <w:ind w:left="4320" w:hanging="360"/>
       </w:pPr>
       <w:rPr>
-        <w:rFonts w:ascii="Wingdings" w:hAnsi="Wingdings" w:hint="default"/>
+        <w:rFonts w:hint="default" w:ascii="Wingdings" w:hAnsi="Wingdings"/>
       </w:rPr>
     </w:lvl>
     <w:lvl w:ilvl="6" w:tplc="04090001" w:tentative="1">
@@ -12844,7 +12475,7 @@
         <w:ind w:left="5040" w:hanging="360"/>
       </w:pPr>
       <w:rPr>
-        <w:rFonts w:ascii="Symbol" w:hAnsi="Symbol" w:hint="default"/>
+        <w:rFonts w:hint="default" w:ascii="Symbol" w:hAnsi="Symbol"/>
       </w:rPr>
     </w:lvl>
     <w:lvl w:ilvl="7" w:tplc="04090003" w:tentative="1">
@@ -12856,7 +12487,7 @@
         <w:ind w:left="5760" w:hanging="360"/>
       </w:pPr>
       <w:rPr>
-        <w:rFonts w:ascii="Courier New" w:hAnsi="Courier New" w:cs="Courier New" w:hint="default"/>
+        <w:rFonts w:hint="default" w:ascii="Courier New" w:hAnsi="Courier New" w:cs="Courier New"/>
       </w:rPr>
     </w:lvl>
     <w:lvl w:ilvl="8" w:tplc="04090005" w:tentative="1">
@@ -12868,7 +12499,7 @@
         <w:ind w:left="6480" w:hanging="360"/>
       </w:pPr>
       <w:rPr>
-        <w:rFonts w:ascii="Wingdings" w:hAnsi="Wingdings" w:hint="default"/>
+        <w:rFonts w:hint="default" w:ascii="Wingdings" w:hAnsi="Wingdings"/>
       </w:rPr>
     </w:lvl>
   </w:abstractNum>
@@ -13087,7 +12718,7 @@
         <w:ind w:left="720" w:hanging="360"/>
       </w:pPr>
       <w:rPr>
-        <w:rFonts w:ascii="Symbol" w:hAnsi="Symbol" w:hint="default"/>
+        <w:rFonts w:hint="default" w:ascii="Symbol" w:hAnsi="Symbol"/>
       </w:rPr>
     </w:lvl>
     <w:lvl w:ilvl="1" w:tplc="FFFFFFFF" w:tentative="1">
@@ -13194,7 +12825,7 @@
         <w:ind w:left="1980" w:hanging="360"/>
       </w:pPr>
       <w:rPr>
-        <w:rFonts w:ascii="Wingdings" w:hAnsi="Wingdings" w:hint="default"/>
+        <w:rFonts w:hint="default" w:ascii="Wingdings" w:hAnsi="Wingdings"/>
       </w:rPr>
     </w:lvl>
     <w:lvl w:ilvl="2" w:tplc="0409001B" w:tentative="1">
@@ -13477,7 +13108,7 @@
         <w:ind w:left="720" w:hanging="360"/>
       </w:pPr>
       <w:rPr>
-        <w:rFonts w:ascii="Times New Roman" w:eastAsia="Calibri" w:hAnsi="Times New Roman" w:cs="Times New Roman" w:hint="default"/>
+        <w:rFonts w:hint="default" w:ascii="Times New Roman" w:hAnsi="Times New Roman" w:eastAsia="Calibri" w:cs="Times New Roman"/>
       </w:rPr>
     </w:lvl>
     <w:lvl w:ilvl="1" w:tplc="04090003" w:tentative="1">
@@ -13489,7 +13120,7 @@
         <w:ind w:left="1440" w:hanging="360"/>
       </w:pPr>
       <w:rPr>
-        <w:rFonts w:ascii="Courier New" w:hAnsi="Courier New" w:cs="Courier New" w:hint="default"/>
+        <w:rFonts w:hint="default" w:ascii="Courier New" w:hAnsi="Courier New" w:cs="Courier New"/>
       </w:rPr>
     </w:lvl>
     <w:lvl w:ilvl="2" w:tplc="04090005" w:tentative="1">
@@ -13501,7 +13132,7 @@
         <w:ind w:left="2160" w:hanging="360"/>
       </w:pPr>
       <w:rPr>
-        <w:rFonts w:ascii="Wingdings" w:hAnsi="Wingdings" w:hint="default"/>
+        <w:rFonts w:hint="default" w:ascii="Wingdings" w:hAnsi="Wingdings"/>
       </w:rPr>
     </w:lvl>
     <w:lvl w:ilvl="3" w:tplc="04090001" w:tentative="1">
@@ -13513,7 +13144,7 @@
         <w:ind w:left="2880" w:hanging="360"/>
       </w:pPr>
       <w:rPr>
-        <w:rFonts w:ascii="Symbol" w:hAnsi="Symbol" w:hint="default"/>
+        <w:rFonts w:hint="default" w:ascii="Symbol" w:hAnsi="Symbol"/>
       </w:rPr>
     </w:lvl>
     <w:lvl w:ilvl="4" w:tplc="04090003" w:tentative="1">
@@ -13525,7 +13156,7 @@
         <w:ind w:left="3600" w:hanging="360"/>
       </w:pPr>
       <w:rPr>
-        <w:rFonts w:ascii="Courier New" w:hAnsi="Courier New" w:cs="Courier New" w:hint="default"/>
+        <w:rFonts w:hint="default" w:ascii="Courier New" w:hAnsi="Courier New" w:cs="Courier New"/>
       </w:rPr>
     </w:lvl>
     <w:lvl w:ilvl="5" w:tplc="04090005" w:tentative="1">
@@ -13537,7 +13168,7 @@
         <w:ind w:left="4320" w:hanging="360"/>
       </w:pPr>
       <w:rPr>
-        <w:rFonts w:ascii="Wingdings" w:hAnsi="Wingdings" w:hint="default"/>
+        <w:rFonts w:hint="default" w:ascii="Wingdings" w:hAnsi="Wingdings"/>
       </w:rPr>
     </w:lvl>
     <w:lvl w:ilvl="6" w:tplc="04090001" w:tentative="1">
@@ -13549,7 +13180,7 @@
         <w:ind w:left="5040" w:hanging="360"/>
       </w:pPr>
       <w:rPr>
-        <w:rFonts w:ascii="Symbol" w:hAnsi="Symbol" w:hint="default"/>
+        <w:rFonts w:hint="default" w:ascii="Symbol" w:hAnsi="Symbol"/>
       </w:rPr>
     </w:lvl>
     <w:lvl w:ilvl="7" w:tplc="04090003" w:tentative="1">
@@ -13561,7 +13192,7 @@
         <w:ind w:left="5760" w:hanging="360"/>
       </w:pPr>
       <w:rPr>
-        <w:rFonts w:ascii="Courier New" w:hAnsi="Courier New" w:cs="Courier New" w:hint="default"/>
+        <w:rFonts w:hint="default" w:ascii="Courier New" w:hAnsi="Courier New" w:cs="Courier New"/>
       </w:rPr>
     </w:lvl>
     <w:lvl w:ilvl="8" w:tplc="04090005" w:tentative="1">
@@ -13573,7 +13204,7 @@
         <w:ind w:left="6480" w:hanging="360"/>
       </w:pPr>
       <w:rPr>
-        <w:rFonts w:ascii="Wingdings" w:hAnsi="Wingdings" w:hint="default"/>
+        <w:rFonts w:hint="default" w:ascii="Wingdings" w:hAnsi="Wingdings"/>
       </w:rPr>
     </w:lvl>
   </w:abstractNum>
@@ -13691,7 +13322,7 @@
         <w:ind w:left="1440" w:hanging="360"/>
       </w:pPr>
       <w:rPr>
-        <w:rFonts w:ascii="Courier New" w:hAnsi="Courier New" w:hint="default"/>
+        <w:rFonts w:hint="default" w:ascii="Courier New" w:hAnsi="Courier New"/>
       </w:rPr>
     </w:lvl>
     <w:lvl w:ilvl="2">
@@ -13706,7 +13337,7 @@
         <w:ind w:left="2160" w:hanging="360"/>
       </w:pPr>
       <w:rPr>
-        <w:rFonts w:ascii="Wingdings" w:hAnsi="Wingdings" w:hint="default"/>
+        <w:rFonts w:hint="default" w:ascii="Wingdings" w:hAnsi="Wingdings"/>
       </w:rPr>
     </w:lvl>
     <w:lvl w:ilvl="3">
@@ -13721,7 +13352,7 @@
         <w:ind w:left="2880" w:hanging="360"/>
       </w:pPr>
       <w:rPr>
-        <w:rFonts w:ascii="Symbol" w:hAnsi="Symbol" w:hint="default"/>
+        <w:rFonts w:hint="default" w:ascii="Symbol" w:hAnsi="Symbol"/>
       </w:rPr>
     </w:lvl>
     <w:lvl w:ilvl="4">
@@ -13736,7 +13367,7 @@
         <w:ind w:left="3600" w:hanging="360"/>
       </w:pPr>
       <w:rPr>
-        <w:rFonts w:ascii="Courier New" w:hAnsi="Courier New" w:hint="default"/>
+        <w:rFonts w:hint="default" w:ascii="Courier New" w:hAnsi="Courier New"/>
       </w:rPr>
     </w:lvl>
     <w:lvl w:ilvl="5">
@@ -13751,7 +13382,7 @@
         <w:ind w:left="4320" w:hanging="360"/>
       </w:pPr>
       <w:rPr>
-        <w:rFonts w:ascii="Wingdings" w:hAnsi="Wingdings" w:hint="default"/>
+        <w:rFonts w:hint="default" w:ascii="Wingdings" w:hAnsi="Wingdings"/>
       </w:rPr>
     </w:lvl>
     <w:lvl w:ilvl="6">
@@ -13766,7 +13397,7 @@
         <w:ind w:left="5040" w:hanging="360"/>
       </w:pPr>
       <w:rPr>
-        <w:rFonts w:ascii="Symbol" w:hAnsi="Symbol" w:hint="default"/>
+        <w:rFonts w:hint="default" w:ascii="Symbol" w:hAnsi="Symbol"/>
       </w:rPr>
     </w:lvl>
     <w:lvl w:ilvl="7">
@@ -13781,7 +13412,7 @@
         <w:ind w:left="5760" w:hanging="360"/>
       </w:pPr>
       <w:rPr>
-        <w:rFonts w:ascii="Courier New" w:hAnsi="Courier New" w:hint="default"/>
+        <w:rFonts w:hint="default" w:ascii="Courier New" w:hAnsi="Courier New"/>
       </w:rPr>
     </w:lvl>
     <w:lvl w:ilvl="8">
@@ -13796,7 +13427,7 @@
         <w:ind w:left="6480" w:hanging="360"/>
       </w:pPr>
       <w:rPr>
-        <w:rFonts w:ascii="Wingdings" w:hAnsi="Wingdings" w:hint="default"/>
+        <w:rFonts w:hint="default" w:ascii="Wingdings" w:hAnsi="Wingdings"/>
       </w:rPr>
     </w:lvl>
   </w:abstractNum>
@@ -13913,7 +13544,7 @@
   <w:docDefaults>
     <w:rPrDefault>
       <w:rPr>
-        <w:rFonts w:asciiTheme="minorHAnsi" w:eastAsiaTheme="minorHAnsi" w:hAnsiTheme="minorHAnsi" w:cstheme="minorBidi"/>
+        <w:rFonts w:asciiTheme="minorHAnsi" w:hAnsiTheme="minorHAnsi" w:eastAsiaTheme="minorHAnsi" w:cstheme="minorBidi"/>
         <w:kern w:val="2"/>
         <w:sz w:val="22"/>
         <w:szCs w:val="22"/>
@@ -13930,14 +13561,14 @@
   <w:latentStyles w:defLockedState="0" w:defUIPriority="99" w:defSemiHidden="0" w:defUnhideWhenUsed="0" w:defQFormat="0" w:count="376">
     <w:lsdException w:name="Normal" w:uiPriority="0" w:qFormat="1"/>
     <w:lsdException w:name="heading 1" w:uiPriority="9" w:qFormat="1"/>
-    <w:lsdException w:name="heading 2" w:semiHidden="1" w:uiPriority="9" w:unhideWhenUsed="1" w:qFormat="1"/>
-    <w:lsdException w:name="heading 3" w:semiHidden="1" w:uiPriority="9" w:unhideWhenUsed="1" w:qFormat="1"/>
-    <w:lsdException w:name="heading 4" w:semiHidden="1" w:uiPriority="9" w:unhideWhenUsed="1" w:qFormat="1"/>
-    <w:lsdException w:name="heading 5" w:semiHidden="1" w:uiPriority="9" w:unhideWhenUsed="1" w:qFormat="1"/>
-    <w:lsdException w:name="heading 6" w:semiHidden="1" w:uiPriority="9" w:unhideWhenUsed="1" w:qFormat="1"/>
-    <w:lsdException w:name="heading 7" w:semiHidden="1" w:uiPriority="9" w:unhideWhenUsed="1" w:qFormat="1"/>
-    <w:lsdException w:name="heading 8" w:semiHidden="1" w:uiPriority="9" w:unhideWhenUsed="1" w:qFormat="1"/>
-    <w:lsdException w:name="heading 9" w:semiHidden="1" w:uiPriority="9" w:unhideWhenUsed="1" w:qFormat="1"/>
+    <w:lsdException w:name="heading 2" w:uiPriority="9" w:semiHidden="1" w:unhideWhenUsed="1" w:qFormat="1"/>
+    <w:lsdException w:name="heading 3" w:uiPriority="9" w:semiHidden="1" w:unhideWhenUsed="1" w:qFormat="1"/>
+    <w:lsdException w:name="heading 4" w:uiPriority="9" w:semiHidden="1" w:unhideWhenUsed="1" w:qFormat="1"/>
+    <w:lsdException w:name="heading 5" w:uiPriority="9" w:semiHidden="1" w:unhideWhenUsed="1" w:qFormat="1"/>
+    <w:lsdException w:name="heading 6" w:uiPriority="9" w:semiHidden="1" w:unhideWhenUsed="1" w:qFormat="1"/>
+    <w:lsdException w:name="heading 7" w:uiPriority="9" w:semiHidden="1" w:unhideWhenUsed="1" w:qFormat="1"/>
+    <w:lsdException w:name="heading 8" w:uiPriority="9" w:semiHidden="1" w:unhideWhenUsed="1" w:qFormat="1"/>
+    <w:lsdException w:name="heading 9" w:uiPriority="9" w:semiHidden="1" w:unhideWhenUsed="1" w:qFormat="1"/>
     <w:lsdException w:name="index 1" w:semiHidden="1" w:unhideWhenUsed="1"/>
     <w:lsdException w:name="index 2" w:semiHidden="1" w:unhideWhenUsed="1"/>
     <w:lsdException w:name="index 3" w:semiHidden="1" w:unhideWhenUsed="1"/>
@@ -13947,22 +13578,22 @@
     <w:lsdException w:name="index 7" w:semiHidden="1" w:unhideWhenUsed="1"/>
     <w:lsdException w:name="index 8" w:semiHidden="1" w:unhideWhenUsed="1"/>
     <w:lsdException w:name="index 9" w:semiHidden="1" w:unhideWhenUsed="1"/>
-    <w:lsdException w:name="toc 1" w:semiHidden="1" w:uiPriority="39" w:unhideWhenUsed="1"/>
-    <w:lsdException w:name="toc 2" w:semiHidden="1" w:uiPriority="39" w:unhideWhenUsed="1"/>
-    <w:lsdException w:name="toc 3" w:semiHidden="1" w:uiPriority="39" w:unhideWhenUsed="1"/>
-    <w:lsdException w:name="toc 4" w:semiHidden="1" w:uiPriority="39" w:unhideWhenUsed="1"/>
-    <w:lsdException w:name="toc 5" w:semiHidden="1" w:uiPriority="39" w:unhideWhenUsed="1"/>
-    <w:lsdException w:name="toc 6" w:semiHidden="1" w:uiPriority="39" w:unhideWhenUsed="1"/>
-    <w:lsdException w:name="toc 7" w:semiHidden="1" w:uiPriority="39" w:unhideWhenUsed="1"/>
-    <w:lsdException w:name="toc 8" w:semiHidden="1" w:uiPriority="39" w:unhideWhenUsed="1"/>
-    <w:lsdException w:name="toc 9" w:semiHidden="1" w:uiPriority="39" w:unhideWhenUsed="1"/>
+    <w:lsdException w:name="toc 1" w:uiPriority="39" w:semiHidden="1" w:unhideWhenUsed="1"/>
+    <w:lsdException w:name="toc 2" w:uiPriority="39" w:semiHidden="1" w:unhideWhenUsed="1"/>
+    <w:lsdException w:name="toc 3" w:uiPriority="39" w:semiHidden="1" w:unhideWhenUsed="1"/>
+    <w:lsdException w:name="toc 4" w:uiPriority="39" w:semiHidden="1" w:unhideWhenUsed="1"/>
+    <w:lsdException w:name="toc 5" w:uiPriority="39" w:semiHidden="1" w:unhideWhenUsed="1"/>
+    <w:lsdException w:name="toc 6" w:uiPriority="39" w:semiHidden="1" w:unhideWhenUsed="1"/>
+    <w:lsdException w:name="toc 7" w:uiPriority="39" w:semiHidden="1" w:unhideWhenUsed="1"/>
+    <w:lsdException w:name="toc 8" w:uiPriority="39" w:semiHidden="1" w:unhideWhenUsed="1"/>
+    <w:lsdException w:name="toc 9" w:uiPriority="39" w:semiHidden="1" w:unhideWhenUsed="1"/>
     <w:lsdException w:name="Normal Indent" w:semiHidden="1" w:unhideWhenUsed="1"/>
     <w:lsdException w:name="footnote text" w:semiHidden="1" w:unhideWhenUsed="1"/>
     <w:lsdException w:name="annotation text" w:semiHidden="1" w:unhideWhenUsed="1"/>
     <w:lsdException w:name="header" w:semiHidden="1" w:unhideWhenUsed="1"/>
     <w:lsdException w:name="footer" w:semiHidden="1" w:unhideWhenUsed="1"/>
     <w:lsdException w:name="index heading" w:semiHidden="1" w:unhideWhenUsed="1"/>
-    <w:lsdException w:name="caption" w:semiHidden="1" w:uiPriority="35" w:unhideWhenUsed="1" w:qFormat="1"/>
+    <w:lsdException w:name="caption" w:uiPriority="35" w:semiHidden="1" w:unhideWhenUsed="1" w:qFormat="1"/>
     <w:lsdException w:name="table of figures" w:semiHidden="1" w:unhideWhenUsed="1"/>
     <w:lsdException w:name="envelope address" w:semiHidden="1" w:unhideWhenUsed="1"/>
     <w:lsdException w:name="envelope return" w:semiHidden="1" w:unhideWhenUsed="1"/>
@@ -13993,7 +13624,7 @@
     <w:lsdException w:name="Title" w:uiPriority="10" w:qFormat="1"/>
     <w:lsdException w:name="Closing" w:semiHidden="1" w:unhideWhenUsed="1"/>
     <w:lsdException w:name="Signature" w:semiHidden="1" w:unhideWhenUsed="1"/>
-    <w:lsdException w:name="Default Paragraph Font" w:semiHidden="1" w:uiPriority="1" w:unhideWhenUsed="1"/>
+    <w:lsdException w:name="Default Paragraph Font" w:uiPriority="1" w:semiHidden="1" w:unhideWhenUsed="1"/>
     <w:lsdException w:name="Body Text" w:semiHidden="1" w:unhideWhenUsed="1"/>
     <w:lsdException w:name="Body Text Indent" w:semiHidden="1" w:unhideWhenUsed="1"/>
     <w:lsdException w:name="List Continue" w:semiHidden="1" w:unhideWhenUsed="1"/>
@@ -14193,8 +13824,8 @@
     <w:lsdException w:name="Subtle Reference" w:uiPriority="31" w:qFormat="1"/>
     <w:lsdException w:name="Intense Reference" w:uiPriority="32" w:qFormat="1"/>
     <w:lsdException w:name="Book Title" w:uiPriority="33" w:qFormat="1"/>
-    <w:lsdException w:name="Bibliography" w:semiHidden="1" w:uiPriority="37" w:unhideWhenUsed="1"/>
-    <w:lsdException w:name="TOC Heading" w:semiHidden="1" w:uiPriority="39" w:unhideWhenUsed="1" w:qFormat="1"/>
+    <w:lsdException w:name="Bibliography" w:uiPriority="37" w:semiHidden="1" w:unhideWhenUsed="1"/>
+    <w:lsdException w:name="TOC Heading" w:uiPriority="39" w:semiHidden="1" w:unhideWhenUsed="1" w:qFormat="1"/>
     <w:lsdException w:name="Plain Table 1" w:uiPriority="41"/>
     <w:lsdException w:name="Plain Table 2" w:uiPriority="42"/>
     <w:lsdException w:name="Plain Table 3" w:uiPriority="43"/>
@@ -14305,7 +13936,7 @@
     <w:lsdException w:name="Unresolved Mention" w:semiHidden="1" w:unhideWhenUsed="1"/>
     <w:lsdException w:name="Smart Link" w:semiHidden="1" w:unhideWhenUsed="1"/>
   </w:latentStyles>
-  <w:style w:type="paragraph" w:default="1" w:styleId="Normal">
+  <w:style w:type="paragraph" w:styleId="Normal" w:default="1">
     <w:name w:val="Normal"/>
     <w:qFormat/>
     <w:rsid w:val="00245B50"/>
@@ -14313,7 +13944,7 @@
       <w:spacing w:after="0" w:line="240" w:lineRule="auto"/>
     </w:pPr>
     <w:rPr>
-      <w:rFonts w:ascii="VNI-Times" w:eastAsia="Times New Roman" w:hAnsi="VNI-Times" w:cs="Times New Roman"/>
+      <w:rFonts w:ascii="VNI-Times" w:hAnsi="VNI-Times" w:eastAsia="Times New Roman" w:cs="Times New Roman"/>
       <w:kern w:val="0"/>
       <w:sz w:val="26"/>
       <w:szCs w:val="20"/>
@@ -14336,7 +13967,7 @@
       <w:outlineLvl w:val="0"/>
     </w:pPr>
     <w:rPr>
-      <w:rFonts w:asciiTheme="majorHAnsi" w:eastAsiaTheme="majorEastAsia" w:hAnsiTheme="majorHAnsi" w:cstheme="majorBidi"/>
+      <w:rFonts w:asciiTheme="majorHAnsi" w:hAnsiTheme="majorHAnsi" w:eastAsiaTheme="majorEastAsia" w:cstheme="majorBidi"/>
       <w:color w:val="0F4761" w:themeColor="accent1" w:themeShade="BF"/>
       <w:sz w:val="40"/>
       <w:szCs w:val="40"/>
@@ -14359,7 +13990,7 @@
       <w:outlineLvl w:val="1"/>
     </w:pPr>
     <w:rPr>
-      <w:rFonts w:asciiTheme="majorHAnsi" w:eastAsiaTheme="majorEastAsia" w:hAnsiTheme="majorHAnsi" w:cstheme="majorBidi"/>
+      <w:rFonts w:asciiTheme="majorHAnsi" w:hAnsiTheme="majorHAnsi" w:eastAsiaTheme="majorEastAsia" w:cstheme="majorBidi"/>
       <w:color w:val="0F4761" w:themeColor="accent1" w:themeShade="BF"/>
       <w:sz w:val="32"/>
       <w:szCs w:val="32"/>
@@ -14518,13 +14149,13 @@
       <w:color w:val="272727" w:themeColor="text1" w:themeTint="D8"/>
     </w:rPr>
   </w:style>
-  <w:style w:type="character" w:default="1" w:styleId="DefaultParagraphFont">
+  <w:style w:type="character" w:styleId="DefaultParagraphFont" w:default="1">
     <w:name w:val="Default Paragraph Font"/>
     <w:uiPriority w:val="1"/>
     <w:semiHidden/>
     <w:unhideWhenUsed/>
   </w:style>
-  <w:style w:type="table" w:default="1" w:styleId="TableNormal">
+  <w:style w:type="table" w:styleId="TableNormal" w:default="1">
     <w:name w:val="Normal Table"/>
     <w:uiPriority w:val="99"/>
     <w:semiHidden/>
@@ -14539,26 +14170,26 @@
       </w:tblCellMar>
     </w:tblPr>
   </w:style>
-  <w:style w:type="numbering" w:default="1" w:styleId="NoList">
+  <w:style w:type="numbering" w:styleId="NoList" w:default="1">
     <w:name w:val="No List"/>
     <w:uiPriority w:val="99"/>
     <w:semiHidden/>
     <w:unhideWhenUsed/>
   </w:style>
-  <w:style w:type="character" w:customStyle="1" w:styleId="Heading1Char">
+  <w:style w:type="character" w:styleId="Heading1Char" w:customStyle="1">
     <w:name w:val="Heading 1 Char"/>
     <w:basedOn w:val="DefaultParagraphFont"/>
     <w:link w:val="Heading1"/>
     <w:uiPriority w:val="9"/>
     <w:rsid w:val="000C456D"/>
     <w:rPr>
-      <w:rFonts w:asciiTheme="majorHAnsi" w:eastAsiaTheme="majorEastAsia" w:hAnsiTheme="majorHAnsi" w:cstheme="majorBidi"/>
+      <w:rFonts w:asciiTheme="majorHAnsi" w:hAnsiTheme="majorHAnsi" w:eastAsiaTheme="majorEastAsia" w:cstheme="majorBidi"/>
       <w:color w:val="0F4761" w:themeColor="accent1" w:themeShade="BF"/>
       <w:sz w:val="40"/>
       <w:szCs w:val="40"/>
     </w:rPr>
   </w:style>
-  <w:style w:type="character" w:customStyle="1" w:styleId="Heading2Char">
+  <w:style w:type="character" w:styleId="Heading2Char" w:customStyle="1">
     <w:name w:val="Heading 2 Char"/>
     <w:basedOn w:val="DefaultParagraphFont"/>
     <w:link w:val="Heading2"/>
@@ -14566,13 +14197,13 @@
     <w:semiHidden/>
     <w:rsid w:val="000C456D"/>
     <w:rPr>
-      <w:rFonts w:asciiTheme="majorHAnsi" w:eastAsiaTheme="majorEastAsia" w:hAnsiTheme="majorHAnsi" w:cstheme="majorBidi"/>
+      <w:rFonts w:asciiTheme="majorHAnsi" w:hAnsiTheme="majorHAnsi" w:eastAsiaTheme="majorEastAsia" w:cstheme="majorBidi"/>
       <w:color w:val="0F4761" w:themeColor="accent1" w:themeShade="BF"/>
       <w:sz w:val="32"/>
       <w:szCs w:val="32"/>
     </w:rPr>
   </w:style>
-  <w:style w:type="character" w:customStyle="1" w:styleId="Heading3Char">
+  <w:style w:type="character" w:styleId="Heading3Char" w:customStyle="1">
     <w:name w:val="Heading 3 Char"/>
     <w:basedOn w:val="DefaultParagraphFont"/>
     <w:link w:val="Heading3"/>
@@ -14586,7 +14217,7 @@
       <w:szCs w:val="28"/>
     </w:rPr>
   </w:style>
-  <w:style w:type="character" w:customStyle="1" w:styleId="Heading4Char">
+  <w:style w:type="character" w:styleId="Heading4Char" w:customStyle="1">
     <w:name w:val="Heading 4 Char"/>
     <w:basedOn w:val="DefaultParagraphFont"/>
     <w:link w:val="Heading4"/>
@@ -14600,7 +14231,7 @@
       <w:color w:val="0F4761" w:themeColor="accent1" w:themeShade="BF"/>
     </w:rPr>
   </w:style>
-  <w:style w:type="character" w:customStyle="1" w:styleId="Heading5Char">
+  <w:style w:type="character" w:styleId="Heading5Char" w:customStyle="1">
     <w:name w:val="Heading 5 Char"/>
     <w:basedOn w:val="DefaultParagraphFont"/>
     <w:link w:val="Heading5"/>
@@ -14612,7 +14243,7 @@
       <w:color w:val="0F4761" w:themeColor="accent1" w:themeShade="BF"/>
     </w:rPr>
   </w:style>
-  <w:style w:type="character" w:customStyle="1" w:styleId="Heading6Char">
+  <w:style w:type="character" w:styleId="Heading6Char" w:customStyle="1">
     <w:name w:val="Heading 6 Char"/>
     <w:basedOn w:val="DefaultParagraphFont"/>
     <w:link w:val="Heading6"/>
@@ -14626,7 +14257,7 @@
       <w:color w:val="595959" w:themeColor="text1" w:themeTint="A6"/>
     </w:rPr>
   </w:style>
-  <w:style w:type="character" w:customStyle="1" w:styleId="Heading7Char">
+  <w:style w:type="character" w:styleId="Heading7Char" w:customStyle="1">
     <w:name w:val="Heading 7 Char"/>
     <w:basedOn w:val="DefaultParagraphFont"/>
     <w:link w:val="Heading7"/>
@@ -14638,7 +14269,7 @@
       <w:color w:val="595959" w:themeColor="text1" w:themeTint="A6"/>
     </w:rPr>
   </w:style>
-  <w:style w:type="character" w:customStyle="1" w:styleId="Heading8Char">
+  <w:style w:type="character" w:styleId="Heading8Char" w:customStyle="1">
     <w:name w:val="Heading 8 Char"/>
     <w:basedOn w:val="DefaultParagraphFont"/>
     <w:link w:val="Heading8"/>
@@ -14652,7 +14283,7 @@
       <w:color w:val="272727" w:themeColor="text1" w:themeTint="D8"/>
     </w:rPr>
   </w:style>
-  <w:style w:type="character" w:customStyle="1" w:styleId="Heading9Char">
+  <w:style w:type="character" w:styleId="Heading9Char" w:customStyle="1">
     <w:name w:val="Heading 9 Char"/>
     <w:basedOn w:val="DefaultParagraphFont"/>
     <w:link w:val="Heading9"/>
@@ -14677,21 +14308,21 @@
       <w:contextualSpacing/>
     </w:pPr>
     <w:rPr>
-      <w:rFonts w:asciiTheme="majorHAnsi" w:eastAsiaTheme="majorEastAsia" w:hAnsiTheme="majorHAnsi" w:cstheme="majorBidi"/>
+      <w:rFonts w:asciiTheme="majorHAnsi" w:hAnsiTheme="majorHAnsi" w:eastAsiaTheme="majorEastAsia" w:cstheme="majorBidi"/>
       <w:spacing w:val="-10"/>
       <w:kern w:val="28"/>
       <w:sz w:val="56"/>
       <w:szCs w:val="56"/>
     </w:rPr>
   </w:style>
-  <w:style w:type="character" w:customStyle="1" w:styleId="TitleChar">
+  <w:style w:type="character" w:styleId="TitleChar" w:customStyle="1">
     <w:name w:val="Title Char"/>
     <w:basedOn w:val="DefaultParagraphFont"/>
     <w:link w:val="Title"/>
     <w:uiPriority w:val="10"/>
     <w:rsid w:val="000C456D"/>
     <w:rPr>
-      <w:rFonts w:asciiTheme="majorHAnsi" w:eastAsiaTheme="majorEastAsia" w:hAnsiTheme="majorHAnsi" w:cstheme="majorBidi"/>
+      <w:rFonts w:asciiTheme="majorHAnsi" w:hAnsiTheme="majorHAnsi" w:eastAsiaTheme="majorEastAsia" w:cstheme="majorBidi"/>
       <w:spacing w:val="-10"/>
       <w:kern w:val="28"/>
       <w:sz w:val="56"/>
@@ -14719,7 +14350,7 @@
       <w:szCs w:val="28"/>
     </w:rPr>
   </w:style>
-  <w:style w:type="character" w:customStyle="1" w:styleId="SubtitleChar">
+  <w:style w:type="character" w:styleId="SubtitleChar" w:customStyle="1">
     <w:name w:val="Subtitle Char"/>
     <w:basedOn w:val="DefaultParagraphFont"/>
     <w:link w:val="Subtitle"/>
@@ -14751,7 +14382,7 @@
       <w:color w:val="404040" w:themeColor="text1" w:themeTint="BF"/>
     </w:rPr>
   </w:style>
-  <w:style w:type="character" w:customStyle="1" w:styleId="QuoteChar">
+  <w:style w:type="character" w:styleId="QuoteChar" w:customStyle="1">
     <w:name w:val="Quote Char"/>
     <w:basedOn w:val="DefaultParagraphFont"/>
     <w:link w:val="Quote"/>
@@ -14796,8 +14427,8 @@
     <w:rsid w:val="000C456D"/>
     <w:pPr>
       <w:pBdr>
-        <w:top w:val="single" w:sz="4" w:space="10" w:color="0F4761" w:themeColor="accent1" w:themeShade="BF"/>
-        <w:bottom w:val="single" w:sz="4" w:space="10" w:color="0F4761" w:themeColor="accent1" w:themeShade="BF"/>
+        <w:top w:val="single" w:color="0F4761" w:themeColor="accent1" w:themeShade="BF" w:sz="4" w:space="10"/>
+        <w:bottom w:val="single" w:color="0F4761" w:themeColor="accent1" w:themeShade="BF" w:sz="4" w:space="10"/>
       </w:pBdr>
       <w:spacing w:before="360" w:after="360"/>
       <w:ind w:left="864" w:right="864"/>
@@ -14809,7 +14440,7 @@
       <w:color w:val="0F4761" w:themeColor="accent1" w:themeShade="BF"/>
     </w:rPr>
   </w:style>
-  <w:style w:type="character" w:customStyle="1" w:styleId="IntenseQuoteChar">
+  <w:style w:type="character" w:styleId="IntenseQuoteChar" w:customStyle="1">
     <w:name w:val="Intense Quote Char"/>
     <w:basedOn w:val="DefaultParagraphFont"/>
     <w:link w:val="IntenseQuote"/>
@@ -14846,7 +14477,7 @@
       <w:iCs/>
     </w:rPr>
   </w:style>
-  <w:style w:type="paragraph" w:customStyle="1" w:styleId="TableParagraph">
+  <w:style w:type="paragraph" w:styleId="TableParagraph" w:customStyle="1">
     <w:name w:val="Table Paragraph"/>
     <w:basedOn w:val="Normal"/>
     <w:uiPriority w:val="1"/>
@@ -14875,13 +14506,13 @@
       <w:spacing w:before="100" w:beforeAutospacing="1" w:after="100" w:afterAutospacing="1"/>
     </w:pPr>
     <w:rPr>
-      <w:rFonts w:ascii="Times New Roman" w:eastAsiaTheme="minorEastAsia" w:hAnsi="Times New Roman"/>
+      <w:rFonts w:ascii="Times New Roman" w:hAnsi="Times New Roman" w:eastAsiaTheme="minorEastAsia"/>
       <w:sz w:val="24"/>
       <w:szCs w:val="24"/>
       <w:lang w:val="vi-VN" w:eastAsia="vi-VN"/>
     </w:rPr>
   </w:style>
-  <w:style w:type="table" w:customStyle="1" w:styleId="TableNormal1">
+  <w:style w:type="table" w:styleId="TableNormal1" w:customStyle="1">
     <w:name w:val="Table Normal1"/>
     <w:uiPriority w:val="99"/>
     <w:semiHidden/>
@@ -14890,7 +14521,7 @@
       <w:spacing w:after="0" w:line="240" w:lineRule="auto"/>
     </w:pPr>
     <w:rPr>
-      <w:rFonts w:ascii="Times New Roman" w:eastAsia="Times New Roman" w:hAnsi="Times New Roman" w:cs="Times New Roman"/>
+      <w:rFonts w:ascii="Times New Roman" w:hAnsi="Times New Roman" w:eastAsia="Times New Roman" w:cs="Times New Roman"/>
       <w:kern w:val="0"/>
       <w:sz w:val="20"/>
       <w:szCs w:val="20"/>
@@ -14929,7 +14560,7 @@
       <w:spacing w:after="120"/>
     </w:pPr>
   </w:style>
-  <w:style w:type="character" w:customStyle="1" w:styleId="BodyTextChar">
+  <w:style w:type="character" w:styleId="BodyTextChar" w:customStyle="1">
     <w:name w:val="Body Text Char"/>
     <w:basedOn w:val="DefaultParagraphFont"/>
     <w:link w:val="BodyText"/>
@@ -14937,7 +14568,7 @@
     <w:semiHidden/>
     <w:rsid w:val="00B275DE"/>
     <w:rPr>
-      <w:rFonts w:ascii="VNI-Times" w:eastAsia="Times New Roman" w:hAnsi="VNI-Times" w:cs="Times New Roman"/>
+      <w:rFonts w:ascii="VNI-Times" w:hAnsi="VNI-Times" w:eastAsia="Times New Roman" w:cs="Times New Roman"/>
       <w:kern w:val="0"/>
       <w:sz w:val="26"/>
       <w:szCs w:val="20"/>
@@ -14962,7 +14593,7 @@
       <w:szCs w:val="16"/>
     </w:rPr>
   </w:style>
-  <w:style w:type="character" w:customStyle="1" w:styleId="BodyTextIndent3Char">
+  <w:style w:type="character" w:styleId="BodyTextIndent3Char" w:customStyle="1">
     <w:name w:val="Body Text Indent 3 Char"/>
     <w:basedOn w:val="DefaultParagraphFont"/>
     <w:link w:val="BodyTextIndent3"/>
@@ -14970,7 +14601,7 @@
     <w:semiHidden/>
     <w:rsid w:val="00B275DE"/>
     <w:rPr>
-      <w:rFonts w:ascii="VNI-Times" w:eastAsia="Times New Roman" w:hAnsi="VNI-Times" w:cs="Times New Roman"/>
+      <w:rFonts w:ascii="VNI-Times" w:hAnsi="VNI-Times" w:eastAsia="Times New Roman" w:cs="Times New Roman"/>
       <w:kern w:val="0"/>
       <w:sz w:val="16"/>
       <w:szCs w:val="16"/>
@@ -14982,7 +14613,7 @@
 </file>
 
 <file path=word/theme/theme1.xml><?xml version="1.0" encoding="utf-8"?>
-<a:theme xmlns:a="http://schemas.openxmlformats.org/drawingml/2006/main" name="Office Theme">
+<a:theme xmlns:thm15="http://schemas.microsoft.com/office/thememl/2012/main" xmlns:a="http://schemas.openxmlformats.org/drawingml/2006/main" name="Office Theme">
   <a:themeElements>
     <a:clrScheme name="Office">
       <a:dk1>

</xml_diff>